<commit_message>
modified:   "papers/A COMPARATIVE ANALYSIS OF PERSONALITY TYPOLOGIES/\320\241\321\200\320\260\320\262\320\275\320\270\321\202\320\265\320\273\321\214\320\275\321\213\320\271 \320\260\320\275\320\260\320\273\320\270\320\267 \321\202\320\270\320\277\320\276\320\273\320\276\320\263\320\270\320\271 \320\273\320\270\321\207\320\275\320\276\321\201\321\202\320\270 MBTI, \321\201\320\276\321\206\320\270\320\276\320\275\320\270\320\272\320\260 \320\270 16-\321\204\320\260\320\272\321\202\320\276\321\200\320\275\321\213\320\271 \320\276\320\277\321\200\320\276\321\201\320\275\320\270\320\272 \320\232\320\265\321\202\321\202\320\265\320\273\320\273\320\260.docx"
</commit_message>
<xml_diff>
--- a/papers/A COMPARATIVE ANALYSIS OF PERSONALITY TYPOLOGIES/Сравнительный анализ типологий личности MBTI, соционика и 16-факторный опросник Кеттелла.docx
+++ b/papers/A COMPARATIVE ANALYSIS OF PERSONALITY TYPOLOGIES/Сравнительный анализ типологий личности MBTI, соционика и 16-факторный опросник Кеттелла.docx
@@ -1618,9 +1618,6 @@
       <w:pPr>
         <w:spacing w:after="0"/>
         <w:ind w:firstLine="709"/>
-        <w:rPr>
-          <w:lang w:val="ru-RU"/>
-        </w:rPr>
       </w:pPr>
     </w:p>
     <w:p>
@@ -1636,9 +1633,6 @@
       <w:pPr>
         <w:spacing w:after="0"/>
         <w:ind w:firstLine="709"/>
-        <w:rPr>
-          <w:lang w:val="ru-RU"/>
-        </w:rPr>
       </w:pPr>
     </w:p>
     <w:p>
@@ -1654,9 +1648,6 @@
       <w:pPr>
         <w:spacing w:after="0"/>
         <w:ind w:firstLine="709"/>
-        <w:rPr>
-          <w:lang w:val="ru-RU"/>
-        </w:rPr>
       </w:pPr>
     </w:p>
     <w:p>
@@ -1671,9 +1662,6 @@
     <w:p>
       <w:pPr>
         <w:spacing w:after="0"/>
-        <w:rPr>
-          <w:lang w:val="ru-RU"/>
-        </w:rPr>
       </w:pPr>
       <w:r>
         <w:tab/>
@@ -1683,9 +1671,6 @@
       <w:pPr>
         <w:spacing w:after="0"/>
         <w:ind w:firstLine="709"/>
-        <w:rPr>
-          <w:lang w:val="ru-RU"/>
-        </w:rPr>
       </w:pPr>
       <w:r>
         <w:rPr>
@@ -1698,7 +1683,6 @@
         <w:rPr>
           <w:b/>
           <w:bCs/>
-          <w:lang w:val="ru-RU"/>
         </w:rPr>
         <w:t>:</w:t>
       </w:r>
@@ -1706,7 +1690,6 @@
         <w:rPr>
           <w:b/>
           <w:bCs/>
-          <w:lang w:val="ru-RU"/>
         </w:rPr>
         <w:t xml:space="preserve"> </w:t>
       </w:r>
@@ -1714,189 +1697,126 @@
         <w:t>personality</w:t>
       </w:r>
       <w:r>
-        <w:rPr>
-          <w:lang w:val="ru-RU"/>
-        </w:rPr>
         <w:t xml:space="preserve"> </w:t>
       </w:r>
       <w:r>
         <w:t>typology</w:t>
       </w:r>
       <w:r>
-        <w:rPr>
-          <w:lang w:val="ru-RU"/>
-        </w:rPr>
         <w:t xml:space="preserve">; </w:t>
       </w:r>
       <w:r>
         <w:t>MBTI</w:t>
       </w:r>
       <w:r>
-        <w:rPr>
-          <w:lang w:val="ru-RU"/>
-        </w:rPr>
         <w:t xml:space="preserve">; </w:t>
       </w:r>
       <w:r>
         <w:t>socionics</w:t>
       </w:r>
       <w:r>
-        <w:rPr>
-          <w:lang w:val="ru-RU"/>
-        </w:rPr>
         <w:t>; 16</w:t>
       </w:r>
       <w:r>
         <w:t>PF</w:t>
       </w:r>
       <w:r>
-        <w:rPr>
-          <w:lang w:val="ru-RU"/>
-        </w:rPr>
         <w:t xml:space="preserve">; </w:t>
       </w:r>
       <w:r>
         <w:t>Cattell</w:t>
       </w:r>
       <w:r>
-        <w:rPr>
-          <w:lang w:val="ru-RU"/>
-        </w:rPr>
         <w:t>’</w:t>
       </w:r>
       <w:r>
         <w:t>s</w:t>
       </w:r>
       <w:r>
-        <w:rPr>
-          <w:lang w:val="ru-RU"/>
-        </w:rPr>
         <w:t xml:space="preserve"> </w:t>
       </w:r>
       <w:r>
         <w:t>personality</w:t>
       </w:r>
       <w:r>
-        <w:rPr>
-          <w:lang w:val="ru-RU"/>
-        </w:rPr>
         <w:t xml:space="preserve"> </w:t>
       </w:r>
       <w:r>
         <w:t>questionnaire</w:t>
       </w:r>
       <w:r>
-        <w:rPr>
-          <w:lang w:val="ru-RU"/>
-        </w:rPr>
         <w:t xml:space="preserve">; </w:t>
       </w:r>
       <w:r>
         <w:t>differential</w:t>
       </w:r>
       <w:r>
-        <w:rPr>
-          <w:lang w:val="ru-RU"/>
-        </w:rPr>
         <w:t xml:space="preserve"> </w:t>
       </w:r>
       <w:r>
         <w:t>psychology</w:t>
       </w:r>
       <w:r>
-        <w:rPr>
-          <w:lang w:val="ru-RU"/>
-        </w:rPr>
         <w:t xml:space="preserve">; </w:t>
       </w:r>
       <w:r>
         <w:t>psychological</w:t>
       </w:r>
       <w:r>
-        <w:rPr>
-          <w:lang w:val="ru-RU"/>
-        </w:rPr>
         <w:t xml:space="preserve"> </w:t>
       </w:r>
       <w:r>
         <w:t>assessment</w:t>
       </w:r>
       <w:r>
-        <w:rPr>
-          <w:lang w:val="ru-RU"/>
-        </w:rPr>
         <w:t xml:space="preserve">; </w:t>
       </w:r>
       <w:r>
         <w:t>personality</w:t>
       </w:r>
       <w:r>
-        <w:rPr>
-          <w:lang w:val="ru-RU"/>
-        </w:rPr>
         <w:t xml:space="preserve"> </w:t>
       </w:r>
       <w:r>
         <w:t>traits</w:t>
       </w:r>
       <w:r>
-        <w:rPr>
-          <w:lang w:val="ru-RU"/>
-        </w:rPr>
         <w:t xml:space="preserve">; </w:t>
       </w:r>
       <w:r>
         <w:t>psychometric</w:t>
       </w:r>
       <w:r>
-        <w:rPr>
-          <w:lang w:val="ru-RU"/>
-        </w:rPr>
         <w:t xml:space="preserve"> </w:t>
       </w:r>
       <w:r>
         <w:t>properties</w:t>
       </w:r>
       <w:r>
-        <w:rPr>
-          <w:lang w:val="ru-RU"/>
-        </w:rPr>
         <w:t xml:space="preserve">; </w:t>
       </w:r>
       <w:r>
         <w:t>test</w:t>
       </w:r>
       <w:r>
-        <w:rPr>
-          <w:lang w:val="ru-RU"/>
-        </w:rPr>
         <w:t xml:space="preserve"> </w:t>
       </w:r>
       <w:r>
         <w:t>validity</w:t>
       </w:r>
       <w:r>
-        <w:rPr>
-          <w:lang w:val="ru-RU"/>
-        </w:rPr>
         <w:t xml:space="preserve"> </w:t>
       </w:r>
       <w:r>
         <w:t>and</w:t>
       </w:r>
       <w:r>
-        <w:rPr>
-          <w:lang w:val="ru-RU"/>
-        </w:rPr>
         <w:t xml:space="preserve"> </w:t>
       </w:r>
       <w:r>
         <w:t>reliability</w:t>
       </w:r>
       <w:r>
-        <w:rPr>
-          <w:lang w:val="ru-RU"/>
-        </w:rPr>
         <w:t>.</w:t>
       </w:r>
     </w:p>
@@ -1909,13 +1829,9 @@
           <w:b/>
           <w:bCs/>
           <w:caps/>
-          <w:lang w:val="ru-RU"/>
-        </w:rPr>
-      </w:pPr>
-      <w:r>
-        <w:rPr>
-          <w:lang w:val="ru-RU"/>
-        </w:rPr>
+        </w:rPr>
+      </w:pPr>
+      <w:r>
         <w:br w:type="page"/>
       </w:r>
     </w:p>
@@ -2345,6 +2261,679 @@
           <w:lang w:val="ru-RU"/>
         </w:rPr>
         <w:lastRenderedPageBreak/>
+        <w:t>Примерный план</w:t>
+      </w:r>
+    </w:p>
+    <w:p>
+      <w:pPr>
+        <w:numPr>
+          <w:ilvl w:val="0"/>
+          <w:numId w:val="37"/>
+        </w:numPr>
+        <w:spacing w:after="0"/>
+        <w:ind w:left="0" w:firstLine="709"/>
+        <w:rPr>
+          <w:lang w:val="ru-RU"/>
+        </w:rPr>
+      </w:pPr>
+      <w:r>
+        <w:rPr>
+          <w:lang w:val="ru-RU"/>
+        </w:rPr>
+        <w:t>Введение</w:t>
+      </w:r>
+      <w:r>
+        <w:rPr>
+          <w:lang w:val="ru-RU"/>
+        </w:rPr>
+        <w:t xml:space="preserve">. </w:t>
+      </w:r>
+      <w:r>
+        <w:rPr>
+          <w:lang w:val="ru-RU"/>
+        </w:rPr>
+        <w:t>Краткая характеристика проблемы описания индивидуальных различий личности.</w:t>
+      </w:r>
+      <w:r>
+        <w:rPr>
+          <w:lang w:val="ru-RU"/>
+        </w:rPr>
+        <w:br/>
+      </w:r>
+      <w:r>
+        <w:rPr>
+          <w:lang w:val="ru-RU"/>
+        </w:rPr>
+        <w:t>Актуальность изучения типологий личности в современной психологии и практике (HR, образование, консультирование).</w:t>
+      </w:r>
+      <w:r>
+        <w:rPr>
+          <w:lang w:val="ru-RU"/>
+        </w:rPr>
+        <w:br/>
+        <w:t>Цель, задачи, объект и предмет исследования; краткое описание структуры работы.</w:t>
+      </w:r>
+    </w:p>
+    <w:p>
+      <w:pPr>
+        <w:numPr>
+          <w:ilvl w:val="0"/>
+          <w:numId w:val="37"/>
+        </w:numPr>
+        <w:spacing w:after="0"/>
+        <w:ind w:left="0" w:firstLine="709"/>
+        <w:rPr>
+          <w:lang w:val="ru-RU"/>
+        </w:rPr>
+      </w:pPr>
+      <w:r>
+        <w:rPr>
+          <w:lang w:val="ru-RU"/>
+        </w:rPr>
+        <w:t>Теоретические основы типологических и факторных моделей личности</w:t>
+      </w:r>
+    </w:p>
+    <w:p>
+      <w:pPr>
+        <w:spacing w:after="0"/>
+        <w:ind w:left="709"/>
+        <w:rPr>
+          <w:lang w:val="ru-RU"/>
+        </w:rPr>
+      </w:pPr>
+      <w:r>
+        <w:rPr>
+          <w:lang w:val="ru-RU"/>
+        </w:rPr>
+        <w:t>2.1. Дифференциальная психология и подходы к изучению личности</w:t>
+      </w:r>
+      <w:r>
+        <w:rPr>
+          <w:lang w:val="ru-RU"/>
+        </w:rPr>
+        <w:br/>
+        <w:t>Понятие личностной черты и типа; отличие типологических и факторных моделей.</w:t>
+      </w:r>
+      <w:r>
+        <w:rPr>
+          <w:lang w:val="ru-RU"/>
+        </w:rPr>
+        <w:br/>
+        <w:t>Основные требования к психодиагностическим методикам (валидность, надёжность, область применения).</w:t>
+      </w:r>
+      <w:r>
+        <w:rPr>
+          <w:lang w:val="ru-RU"/>
+        </w:rPr>
+        <w:br/>
+        <w:t xml:space="preserve">2.2. </w:t>
+      </w:r>
+      <w:proofErr w:type="spellStart"/>
+      <w:r>
+        <w:rPr>
+          <w:lang w:val="ru-RU"/>
+        </w:rPr>
+        <w:t>Юнгианская</w:t>
+      </w:r>
+      <w:proofErr w:type="spellEnd"/>
+      <w:r>
+        <w:rPr>
+          <w:lang w:val="ru-RU"/>
+        </w:rPr>
+        <w:t xml:space="preserve"> теория психологических типов как база MBTI и соционики</w:t>
+      </w:r>
+      <w:r>
+        <w:rPr>
+          <w:lang w:val="ru-RU"/>
+        </w:rPr>
+        <w:br/>
+        <w:t>Ключевые положения К. Г. Юнга о психологических функциях и установках.</w:t>
+      </w:r>
+      <w:r>
+        <w:rPr>
+          <w:lang w:val="ru-RU"/>
+        </w:rPr>
+        <w:br/>
+        <w:t xml:space="preserve">Ограничения </w:t>
+      </w:r>
+      <w:proofErr w:type="spellStart"/>
+      <w:r>
+        <w:rPr>
+          <w:lang w:val="ru-RU"/>
+        </w:rPr>
+        <w:t>юнгианской</w:t>
+      </w:r>
+      <w:proofErr w:type="spellEnd"/>
+      <w:r>
+        <w:rPr>
+          <w:lang w:val="ru-RU"/>
+        </w:rPr>
+        <w:t xml:space="preserve"> типологии с точки зрения современной науки.</w:t>
+      </w:r>
+      <w:r>
+        <w:rPr>
+          <w:lang w:val="ru-RU"/>
+        </w:rPr>
+        <w:br/>
+        <w:t xml:space="preserve">2.3. </w:t>
+      </w:r>
+      <w:proofErr w:type="spellStart"/>
+      <w:r>
+        <w:rPr>
+          <w:lang w:val="ru-RU"/>
+        </w:rPr>
+        <w:t>Факторно</w:t>
+      </w:r>
+      <w:proofErr w:type="spellEnd"/>
+      <w:r>
+        <w:rPr>
+          <w:lang w:val="ru-RU"/>
+        </w:rPr>
+        <w:t xml:space="preserve">-аналитический подход Р. </w:t>
+      </w:r>
+      <w:proofErr w:type="spellStart"/>
+      <w:r>
+        <w:rPr>
+          <w:lang w:val="ru-RU"/>
+        </w:rPr>
+        <w:t>Кеттелла</w:t>
+      </w:r>
+      <w:proofErr w:type="spellEnd"/>
+      <w:r>
+        <w:rPr>
+          <w:lang w:val="ru-RU"/>
+        </w:rPr>
+        <w:t xml:space="preserve"> и модель 16PF</w:t>
+      </w:r>
+      <w:r>
+        <w:rPr>
+          <w:lang w:val="ru-RU"/>
+        </w:rPr>
+        <w:br/>
+        <w:t>Идея выявления личностных факторов на основе факторного анализа.</w:t>
+      </w:r>
+      <w:r>
+        <w:rPr>
+          <w:lang w:val="ru-RU"/>
+        </w:rPr>
+        <w:br/>
+        <w:t>16PF как переход к количественному измерению черт личности.​</w:t>
+      </w:r>
+    </w:p>
+    <w:p>
+      <w:pPr>
+        <w:numPr>
+          <w:ilvl w:val="0"/>
+          <w:numId w:val="37"/>
+        </w:numPr>
+        <w:spacing w:after="0"/>
+        <w:ind w:left="0" w:firstLine="709"/>
+        <w:rPr>
+          <w:lang w:val="ru-RU"/>
+        </w:rPr>
+      </w:pPr>
+      <w:r>
+        <w:rPr>
+          <w:lang w:val="ru-RU"/>
+        </w:rPr>
+        <w:lastRenderedPageBreak/>
+        <w:t>Типология личности MBTI: структура, интерпретация, критика</w:t>
+      </w:r>
+    </w:p>
+    <w:p>
+      <w:pPr>
+        <w:spacing w:after="0"/>
+        <w:ind w:left="709"/>
+        <w:rPr>
+          <w:lang w:val="ru-RU"/>
+        </w:rPr>
+      </w:pPr>
+      <w:r>
+        <w:rPr>
+          <w:lang w:val="ru-RU"/>
+        </w:rPr>
+        <w:t>3.1. Структура опросника MBTI и система 16 типов</w:t>
+      </w:r>
+      <w:r>
+        <w:rPr>
+          <w:lang w:val="ru-RU"/>
+        </w:rPr>
+        <w:br/>
+        <w:t>Четыре дихотомии (E–I, S–N, T–F, J–P) и их комбинации.​</w:t>
+      </w:r>
+      <w:r>
+        <w:rPr>
+          <w:lang w:val="ru-RU"/>
+        </w:rPr>
+        <w:br/>
+        <w:t>Принципы интерпретации «типа личности» и области популярного применения.</w:t>
+      </w:r>
+      <w:r>
+        <w:rPr>
+          <w:lang w:val="ru-RU"/>
+        </w:rPr>
+        <w:br/>
+        <w:t>3.2. Психометрические свойства MBTI и основные направления критики</w:t>
+      </w:r>
+      <w:r>
+        <w:rPr>
+          <w:lang w:val="ru-RU"/>
+        </w:rPr>
+        <w:br/>
+        <w:t>Проблемы надёжности (нестабильность типа при повторном тестировании).</w:t>
+      </w:r>
+      <w:r>
+        <w:rPr>
+          <w:lang w:val="ru-RU"/>
+        </w:rPr>
+        <w:br/>
+        <w:t>Ограниченная валидность и риск упрощённого «</w:t>
+      </w:r>
+      <w:proofErr w:type="spellStart"/>
+      <w:r>
+        <w:rPr>
+          <w:lang w:val="ru-RU"/>
+        </w:rPr>
+        <w:t>ярлыкования</w:t>
+      </w:r>
+      <w:proofErr w:type="spellEnd"/>
+      <w:r>
+        <w:rPr>
+          <w:lang w:val="ru-RU"/>
+        </w:rPr>
+        <w:t>» личности.</w:t>
+      </w:r>
+    </w:p>
+    <w:p>
+      <w:pPr>
+        <w:numPr>
+          <w:ilvl w:val="0"/>
+          <w:numId w:val="37"/>
+        </w:numPr>
+        <w:spacing w:after="0"/>
+        <w:ind w:left="0" w:firstLine="709"/>
+        <w:rPr>
+          <w:lang w:val="ru-RU"/>
+        </w:rPr>
+      </w:pPr>
+      <w:r>
+        <w:rPr>
+          <w:lang w:val="ru-RU"/>
+        </w:rPr>
+        <w:t xml:space="preserve">Соционика как развитие </w:t>
+      </w:r>
+      <w:proofErr w:type="spellStart"/>
+      <w:r>
+        <w:rPr>
+          <w:lang w:val="ru-RU"/>
+        </w:rPr>
+        <w:t>юнгианской</w:t>
+      </w:r>
+      <w:proofErr w:type="spellEnd"/>
+      <w:r>
+        <w:rPr>
+          <w:lang w:val="ru-RU"/>
+        </w:rPr>
+        <w:t xml:space="preserve"> типологии</w:t>
+      </w:r>
+      <w:r>
+        <w:rPr>
+          <w:lang w:val="ru-RU"/>
+        </w:rPr>
+        <w:br/>
+        <w:t>4.1. Понятие информационного метаболизма и 16 социотипов</w:t>
+      </w:r>
+      <w:r>
+        <w:rPr>
+          <w:lang w:val="ru-RU"/>
+        </w:rPr>
+        <w:br/>
+        <w:t>Модель А, восемь функций и представление о структуре психики.</w:t>
+      </w:r>
+      <w:r>
+        <w:rPr>
+          <w:lang w:val="ru-RU"/>
+        </w:rPr>
+        <w:br/>
+        <w:t>Соотношение соционики и MBTI: сходства и различия в трактовках типов.</w:t>
+      </w:r>
+      <w:r>
+        <w:rPr>
+          <w:lang w:val="ru-RU"/>
+        </w:rPr>
+        <w:br/>
+        <w:t xml:space="preserve">4.2. </w:t>
+      </w:r>
+      <w:proofErr w:type="spellStart"/>
+      <w:r>
+        <w:rPr>
+          <w:lang w:val="ru-RU"/>
+        </w:rPr>
+        <w:t>Межтипные</w:t>
+      </w:r>
+      <w:proofErr w:type="spellEnd"/>
+      <w:r>
+        <w:rPr>
+          <w:lang w:val="ru-RU"/>
+        </w:rPr>
+        <w:t xml:space="preserve"> отношения и практическое использование соционики</w:t>
+      </w:r>
+      <w:r>
+        <w:rPr>
+          <w:lang w:val="ru-RU"/>
+        </w:rPr>
+        <w:br/>
+        <w:t xml:space="preserve">Концепция </w:t>
+      </w:r>
+      <w:proofErr w:type="spellStart"/>
+      <w:r>
+        <w:rPr>
+          <w:lang w:val="ru-RU"/>
+        </w:rPr>
+        <w:t>межтипных</w:t>
+      </w:r>
+      <w:proofErr w:type="spellEnd"/>
+      <w:r>
+        <w:rPr>
+          <w:lang w:val="ru-RU"/>
+        </w:rPr>
+        <w:t xml:space="preserve"> отношений (</w:t>
+      </w:r>
+      <w:proofErr w:type="spellStart"/>
+      <w:r>
+        <w:rPr>
+          <w:lang w:val="ru-RU"/>
+        </w:rPr>
+        <w:t>дуальность</w:t>
+      </w:r>
+      <w:proofErr w:type="spellEnd"/>
+      <w:r>
+        <w:rPr>
+          <w:lang w:val="ru-RU"/>
+        </w:rPr>
+        <w:t>, конфликт, ревизия и др.).</w:t>
+      </w:r>
+      <w:r>
+        <w:rPr>
+          <w:lang w:val="ru-RU"/>
+        </w:rPr>
+        <w:br/>
+        <w:t>Популярность соционики в неформальных сообществах и отсутствие стандартизированной психометрической базы.</w:t>
+      </w:r>
+    </w:p>
+    <w:p>
+      <w:pPr>
+        <w:numPr>
+          <w:ilvl w:val="0"/>
+          <w:numId w:val="37"/>
+        </w:numPr>
+        <w:spacing w:after="0"/>
+        <w:ind w:left="0" w:firstLine="709"/>
+        <w:rPr>
+          <w:lang w:val="ru-RU"/>
+        </w:rPr>
+      </w:pPr>
+      <w:r>
+        <w:rPr>
+          <w:lang w:val="ru-RU"/>
+        </w:rPr>
+        <w:t xml:space="preserve">16-факторный опросник личности </w:t>
+      </w:r>
+      <w:proofErr w:type="spellStart"/>
+      <w:r>
+        <w:rPr>
+          <w:lang w:val="ru-RU"/>
+        </w:rPr>
+        <w:t>Кеттелла</w:t>
+      </w:r>
+      <w:proofErr w:type="spellEnd"/>
+      <w:r>
+        <w:rPr>
+          <w:lang w:val="ru-RU"/>
+        </w:rPr>
+        <w:t xml:space="preserve"> (16PF)</w:t>
+      </w:r>
+      <w:r>
+        <w:rPr>
+          <w:lang w:val="ru-RU"/>
+        </w:rPr>
+        <w:br/>
+        <w:t>5.1. Структура опросника и содержание основных факторов</w:t>
+      </w:r>
+      <w:r>
+        <w:rPr>
+          <w:lang w:val="ru-RU"/>
+        </w:rPr>
+        <w:br/>
+        <w:t>Перечень и краткая характеристика 16 первичных факторов и глобальных шкал.​</w:t>
+      </w:r>
+      <w:r>
+        <w:rPr>
+          <w:lang w:val="ru-RU"/>
+        </w:rPr>
+        <w:br/>
+        <w:t xml:space="preserve">Формат шкал (континуальные измерения) и особенности </w:t>
+      </w:r>
+      <w:r>
+        <w:rPr>
+          <w:lang w:val="ru-RU"/>
+        </w:rPr>
+        <w:lastRenderedPageBreak/>
+        <w:t>интерпретации профиля личности.​</w:t>
+      </w:r>
+      <w:r>
+        <w:rPr>
+          <w:lang w:val="ru-RU"/>
+        </w:rPr>
+        <w:br/>
+        <w:t>5.2. Психометрические характеристики и сферы применения 16PF</w:t>
+      </w:r>
+      <w:r>
+        <w:rPr>
+          <w:lang w:val="ru-RU"/>
+        </w:rPr>
+        <w:br/>
+        <w:t>Данные о валидности и надёжности опросника; адаптации в разных странах.</w:t>
+      </w:r>
+      <w:r>
+        <w:rPr>
+          <w:lang w:val="ru-RU"/>
+        </w:rPr>
+        <w:br/>
+        <w:t>Применение в клинической, организационной, карьерной и исследовательской практике.</w:t>
+      </w:r>
+    </w:p>
+    <w:p>
+      <w:pPr>
+        <w:numPr>
+          <w:ilvl w:val="0"/>
+          <w:numId w:val="37"/>
+        </w:numPr>
+        <w:spacing w:after="0"/>
+        <w:ind w:left="0" w:firstLine="709"/>
+        <w:rPr>
+          <w:lang w:val="ru-RU"/>
+        </w:rPr>
+      </w:pPr>
+      <w:r>
+        <w:rPr>
+          <w:lang w:val="ru-RU"/>
+        </w:rPr>
+        <w:t>Сравнительный анализ MBTI, соционики и 16PF</w:t>
+      </w:r>
+      <w:r>
+        <w:rPr>
+          <w:lang w:val="ru-RU"/>
+        </w:rPr>
+        <w:br/>
+        <w:t>6.1. Сопоставление теоретических оснований и измеряемых конструктов</w:t>
+      </w:r>
+      <w:r>
+        <w:rPr>
+          <w:lang w:val="ru-RU"/>
+        </w:rPr>
+        <w:br/>
+        <w:t xml:space="preserve">Общие </w:t>
+      </w:r>
+      <w:proofErr w:type="spellStart"/>
+      <w:r>
+        <w:rPr>
+          <w:lang w:val="ru-RU"/>
+        </w:rPr>
+        <w:t>юнгианские</w:t>
+      </w:r>
+      <w:proofErr w:type="spellEnd"/>
+      <w:r>
+        <w:rPr>
+          <w:lang w:val="ru-RU"/>
+        </w:rPr>
+        <w:t xml:space="preserve"> корни MBTI и соционики против </w:t>
+      </w:r>
+      <w:proofErr w:type="spellStart"/>
+      <w:r>
+        <w:rPr>
+          <w:lang w:val="ru-RU"/>
+        </w:rPr>
+        <w:t>факторно</w:t>
+      </w:r>
+      <w:proofErr w:type="spellEnd"/>
+      <w:r>
+        <w:rPr>
+          <w:lang w:val="ru-RU"/>
+        </w:rPr>
+        <w:t>-аналитического подхода 16PF.</w:t>
+      </w:r>
+      <w:r>
+        <w:rPr>
+          <w:lang w:val="ru-RU"/>
+        </w:rPr>
+        <w:br/>
+        <w:t xml:space="preserve">Тип </w:t>
+      </w:r>
+      <w:proofErr w:type="spellStart"/>
+      <w:r>
+        <w:rPr>
+          <w:lang w:val="ru-RU"/>
+        </w:rPr>
+        <w:t>vs</w:t>
+      </w:r>
+      <w:proofErr w:type="spellEnd"/>
+      <w:r>
+        <w:rPr>
+          <w:lang w:val="ru-RU"/>
+        </w:rPr>
+        <w:t>. черта: категориальные и континуальные модели личности.</w:t>
+      </w:r>
+      <w:r>
+        <w:rPr>
+          <w:lang w:val="ru-RU"/>
+        </w:rPr>
+        <w:br/>
+        <w:t>6.2. Сравнение психометрических свойств и областей допустимого применения</w:t>
+      </w:r>
+      <w:r>
+        <w:rPr>
+          <w:lang w:val="ru-RU"/>
+        </w:rPr>
+        <w:br/>
+        <w:t>Обзор данных о валидности и надёжности трёх подходов.</w:t>
+      </w:r>
+      <w:r>
+        <w:rPr>
+          <w:lang w:val="ru-RU"/>
+        </w:rPr>
+        <w:br/>
+        <w:t xml:space="preserve">Рекомендации по использованию: популярная самооценка и тренинги (MBTI, соционика) </w:t>
+      </w:r>
+      <w:proofErr w:type="spellStart"/>
+      <w:r>
+        <w:rPr>
+          <w:lang w:val="ru-RU"/>
+        </w:rPr>
+        <w:t>vs</w:t>
+      </w:r>
+      <w:proofErr w:type="spellEnd"/>
+      <w:r>
+        <w:rPr>
+          <w:lang w:val="ru-RU"/>
+        </w:rPr>
+        <w:t>. профессиональная психодиагностика и научные исследования (16PF).</w:t>
+      </w:r>
+    </w:p>
+    <w:p>
+      <w:pPr>
+        <w:numPr>
+          <w:ilvl w:val="0"/>
+          <w:numId w:val="37"/>
+        </w:numPr>
+        <w:spacing w:after="0"/>
+        <w:ind w:left="0" w:firstLine="709"/>
+        <w:rPr>
+          <w:lang w:val="ru-RU"/>
+        </w:rPr>
+      </w:pPr>
+      <w:r>
+        <w:rPr>
+          <w:lang w:val="ru-RU"/>
+        </w:rPr>
+        <w:t>Заключение</w:t>
+      </w:r>
+      <w:r>
+        <w:rPr>
+          <w:lang w:val="ru-RU"/>
+        </w:rPr>
+        <w:br/>
+        <w:t>Сводные выводы о сильных и слабых сторонах типологических и факторных моделей личности.</w:t>
+      </w:r>
+      <w:r>
+        <w:rPr>
+          <w:lang w:val="ru-RU"/>
+        </w:rPr>
+        <w:br/>
+        <w:t xml:space="preserve">Ограничения работы и перспективы дальнейших исследований (например, сравнение 16PF с Big </w:t>
+      </w:r>
+      <w:proofErr w:type="spellStart"/>
+      <w:r>
+        <w:rPr>
+          <w:lang w:val="ru-RU"/>
+        </w:rPr>
+        <w:t>Five</w:t>
+      </w:r>
+      <w:proofErr w:type="spellEnd"/>
+      <w:r>
+        <w:rPr>
+          <w:lang w:val="ru-RU"/>
+        </w:rPr>
+        <w:t xml:space="preserve"> или эмпирическая проверка связи между типами MBTI/соционики и факторами 16PF).</w:t>
+      </w:r>
+    </w:p>
+    <w:p>
+      <w:pPr>
+        <w:spacing w:line="278" w:lineRule="auto"/>
+        <w:jc w:val="left"/>
+        <w:rPr>
+          <w:lang w:val="ru-RU"/>
+        </w:rPr>
+      </w:pPr>
+      <w:r>
+        <w:rPr>
+          <w:lang w:val="ru-RU"/>
+        </w:rPr>
+        <w:br w:type="page"/>
+      </w:r>
+    </w:p>
+    <w:p>
+      <w:pPr>
+        <w:pStyle w:val="1"/>
+        <w:rPr>
+          <w:lang w:val="ru-RU"/>
+        </w:rPr>
+      </w:pPr>
+      <w:r>
+        <w:rPr>
+          <w:lang w:val="ru-RU"/>
+        </w:rPr>
+        <w:lastRenderedPageBreak/>
         <w:t>ГЛОССАРИЙ</w:t>
       </w:r>
     </w:p>
@@ -3206,7 +3795,14 @@
         <w:rPr>
           <w:lang w:val="ru-RU"/>
         </w:rPr>
-        <w:t>При этом популярность типологических моделей среди практиков и неспециалистов нередко сочетается с критикой со стороны исследователей, указывающих на проблемы валидности, надежности и избыточной упрощенности таких подходов.</w:t>
+        <w:t xml:space="preserve">При этом популярность типологических моделей среди практиков и неспециалистов нередко сочетается с критикой со стороны </w:t>
+      </w:r>
+      <w:r>
+        <w:rPr>
+          <w:lang w:val="ru-RU"/>
+        </w:rPr>
+        <w:lastRenderedPageBreak/>
+        <w:t>исследователей, указывающих на проблемы валидности, надежности и избыточной упрощенности таких подходов.</w:t>
       </w:r>
     </w:p>
     <w:p>
@@ -3230,14 +3826,7 @@
         <w:rPr>
           <w:lang w:val="ru-RU"/>
         </w:rPr>
-        <w:t xml:space="preserve">Возникает противоречие между востребованностью простых типологий в обучении, HR и саморазвитии, с одной стороны, и </w:t>
-      </w:r>
-      <w:r>
-        <w:rPr>
-          <w:lang w:val="ru-RU"/>
-        </w:rPr>
-        <w:lastRenderedPageBreak/>
-        <w:t>требованиями научной психометрии к строгим диагностическим методам — с другой.</w:t>
+        <w:t>Возникает противоречие между востребованностью простых типологий в обучении, HR и саморазвитии, с одной стороны, и требованиями научной психометрии к строгим диагностическим методам — с другой.</w:t>
       </w:r>
     </w:p>
     <w:p>
@@ -3332,7 +3921,1160 @@
     </w:p>
     <w:p>
       <w:pPr>
-        <w:spacing w:after="0"/>
+        <w:spacing w:line="278" w:lineRule="auto"/>
+        <w:jc w:val="left"/>
+        <w:rPr>
+          <w:b/>
+          <w:bCs/>
+          <w:lang w:val="ru-RU"/>
+        </w:rPr>
+      </w:pPr>
+      <w:r>
+        <w:rPr>
+          <w:b/>
+          <w:bCs/>
+          <w:lang w:val="ru-RU"/>
+        </w:rPr>
+        <w:br w:type="page"/>
+      </w:r>
+    </w:p>
+    <w:p>
+      <w:pPr>
+        <w:pStyle w:val="1"/>
+        <w:rPr>
+          <w:lang w:val="ru-RU"/>
+        </w:rPr>
+      </w:pPr>
+      <w:r>
+        <w:rPr>
+          <w:lang w:val="ru-RU"/>
+        </w:rPr>
+        <w:lastRenderedPageBreak/>
+        <w:t>1. Теоретические основы типологических и факторных моделей личности</w:t>
+      </w:r>
+    </w:p>
+    <w:p>
+      <w:pPr>
+        <w:spacing w:after="0"/>
+        <w:ind w:firstLine="709"/>
+        <w:rPr>
+          <w:lang w:val="ru-RU"/>
+        </w:rPr>
+      </w:pPr>
+    </w:p>
+    <w:p>
+      <w:pPr>
+        <w:spacing w:after="0"/>
+        <w:ind w:firstLine="709"/>
+        <w:rPr>
+          <w:lang w:val="ru-RU"/>
+        </w:rPr>
+      </w:pPr>
+      <w:r>
+        <w:rPr>
+          <w:lang w:val="ru-RU"/>
+        </w:rPr>
+        <w:t>Современная дифференциальная психология рассматривает личность как систему относительно устойчивых индивидуальных различий, которые проявляются в типичных способах поведения, переживания и взаимодействия с миром.</w:t>
+      </w:r>
+    </w:p>
+    <w:p>
+      <w:pPr>
+        <w:spacing w:after="0"/>
+        <w:ind w:firstLine="709"/>
+        <w:rPr>
+          <w:lang w:val="ru-RU"/>
+        </w:rPr>
+      </w:pPr>
+    </w:p>
+    <w:p>
+      <w:pPr>
+        <w:spacing w:after="0"/>
+        <w:ind w:firstLine="709"/>
+        <w:rPr>
+          <w:lang w:val="ru-RU"/>
+        </w:rPr>
+      </w:pPr>
+      <w:r>
+        <w:rPr>
+          <w:lang w:val="ru-RU"/>
+        </w:rPr>
+        <w:t>На уровне методологии это порождает два больших подхода к описанию личности: типологический, стремящийся разделить людей на ограниченное число качественно различных типов, и факторный (чертовой), описывающий индивидуальные различия через непрерывные измерения выраженности отдельных свойств.</w:t>
+      </w:r>
+    </w:p>
+    <w:p>
+      <w:pPr>
+        <w:spacing w:after="0"/>
+        <w:ind w:firstLine="709"/>
+        <w:rPr>
+          <w:lang w:val="ru-RU"/>
+        </w:rPr>
+      </w:pPr>
+    </w:p>
+    <w:p>
+      <w:pPr>
+        <w:spacing w:after="0"/>
+        <w:ind w:firstLine="709"/>
+        <w:rPr>
+          <w:lang w:val="ru-RU"/>
+        </w:rPr>
+      </w:pPr>
+      <w:r>
+        <w:rPr>
+          <w:lang w:val="ru-RU"/>
+        </w:rPr>
+        <w:t>Типологические модели привлекательны своей простотой, наглядностью и удобством для повседневного использования: принадлежность к «типу» легко запоминается и превращается в язык для обсуждения различий в коллективе.</w:t>
+      </w:r>
+    </w:p>
+    <w:p>
+      <w:pPr>
+        <w:spacing w:after="0"/>
+        <w:ind w:firstLine="709"/>
+        <w:rPr>
+          <w:lang w:val="ru-RU"/>
+        </w:rPr>
+      </w:pPr>
+    </w:p>
+    <w:p>
+      <w:pPr>
+        <w:spacing w:after="0"/>
+        <w:ind w:firstLine="709"/>
+        <w:rPr>
+          <w:lang w:val="ru-RU"/>
+        </w:rPr>
+      </w:pPr>
+      <w:r>
+        <w:rPr>
+          <w:lang w:val="ru-RU"/>
+        </w:rPr>
+        <w:t xml:space="preserve">Однако разделение людей на небольшое число категорий неизбежно приводит к потере информации о </w:t>
+      </w:r>
+      <w:proofErr w:type="spellStart"/>
+      <w:r>
+        <w:rPr>
+          <w:lang w:val="ru-RU"/>
+        </w:rPr>
+        <w:t>межиндивидуальных</w:t>
+      </w:r>
+      <w:proofErr w:type="spellEnd"/>
+      <w:r>
+        <w:rPr>
+          <w:lang w:val="ru-RU"/>
+        </w:rPr>
+        <w:t xml:space="preserve"> различиях внутри типов и риску </w:t>
+      </w:r>
+      <w:r>
+        <w:rPr>
+          <w:lang w:val="ru-RU"/>
+        </w:rPr>
+        <w:t xml:space="preserve">выдавать </w:t>
+      </w:r>
+      <w:r>
+        <w:rPr>
+          <w:lang w:val="ru-RU"/>
+        </w:rPr>
+        <w:t>«ярл</w:t>
+      </w:r>
+      <w:r>
+        <w:rPr>
+          <w:lang w:val="ru-RU"/>
+        </w:rPr>
+        <w:t>ыки</w:t>
+      </w:r>
+      <w:r>
+        <w:rPr>
+          <w:lang w:val="ru-RU"/>
+        </w:rPr>
+        <w:t>» сложны</w:t>
+      </w:r>
+      <w:r>
+        <w:rPr>
+          <w:lang w:val="ru-RU"/>
+        </w:rPr>
+        <w:t>м</w:t>
+      </w:r>
+      <w:r>
+        <w:rPr>
+          <w:lang w:val="ru-RU"/>
+        </w:rPr>
+        <w:t xml:space="preserve"> личностны</w:t>
+      </w:r>
+      <w:r>
+        <w:rPr>
+          <w:lang w:val="ru-RU"/>
+        </w:rPr>
+        <w:t>м</w:t>
+      </w:r>
+      <w:r>
+        <w:rPr>
+          <w:lang w:val="ru-RU"/>
+        </w:rPr>
+        <w:t xml:space="preserve"> профил</w:t>
+      </w:r>
+      <w:r>
+        <w:rPr>
+          <w:lang w:val="ru-RU"/>
+        </w:rPr>
+        <w:t>ям</w:t>
+      </w:r>
+      <w:r>
+        <w:rPr>
+          <w:lang w:val="ru-RU"/>
+        </w:rPr>
+        <w:t>.</w:t>
+      </w:r>
+    </w:p>
+    <w:p>
+      <w:pPr>
+        <w:spacing w:after="0"/>
+        <w:ind w:firstLine="709"/>
+        <w:rPr>
+          <w:lang w:val="ru-RU"/>
+        </w:rPr>
+      </w:pPr>
+    </w:p>
+    <w:p>
+      <w:pPr>
+        <w:spacing w:after="0"/>
+        <w:ind w:firstLine="709"/>
+        <w:rPr>
+          <w:lang w:val="ru-RU"/>
+        </w:rPr>
+      </w:pPr>
+      <w:r>
+        <w:rPr>
+          <w:lang w:val="ru-RU"/>
+        </w:rPr>
+        <w:t xml:space="preserve">Факторные подходы, напротив, исходят из того, что основные черты распределены в популяции континуально, и предлагают </w:t>
+      </w:r>
+      <w:r>
+        <w:rPr>
+          <w:lang w:val="ru-RU"/>
+        </w:rPr>
+        <w:lastRenderedPageBreak/>
+        <w:t>измерять их как количественные переменные, что лучше соответствует статистической природе данных о личности.</w:t>
+      </w:r>
+    </w:p>
+    <w:p>
+      <w:pPr>
+        <w:spacing w:after="0"/>
+        <w:ind w:firstLine="709"/>
+        <w:rPr>
+          <w:lang w:val="ru-RU"/>
+        </w:rPr>
+      </w:pPr>
+    </w:p>
+    <w:p>
+      <w:pPr>
+        <w:spacing w:after="0"/>
+        <w:ind w:firstLine="709"/>
+        <w:rPr>
+          <w:lang w:val="ru-RU"/>
+        </w:rPr>
+      </w:pPr>
+      <w:r>
+        <w:rPr>
+          <w:b/>
+          <w:bCs/>
+          <w:lang w:val="ru-RU"/>
+        </w:rPr>
+        <w:t>С точки зрения психометрии к любой модели личности предъявляются базовые требования:</w:t>
+      </w:r>
+      <w:r>
+        <w:rPr>
+          <w:lang w:val="ru-RU"/>
+        </w:rPr>
+        <w:t xml:space="preserve"> содержание шкал должно опираться на теорию и эмпирические данные, показатели — демонстрировать приемлемую надёжность (устойчивость измерений) и валидность (соответствие измеряемому конструкту и внешним критериям), а область применения — быть чётко ограниченной.</w:t>
+      </w:r>
+    </w:p>
+    <w:p>
+      <w:pPr>
+        <w:spacing w:after="0"/>
+        <w:ind w:firstLine="709"/>
+        <w:rPr>
+          <w:lang w:val="ru-RU"/>
+        </w:rPr>
+      </w:pPr>
+    </w:p>
+    <w:p>
+      <w:pPr>
+        <w:spacing w:after="0"/>
+        <w:ind w:firstLine="709"/>
+        <w:rPr>
+          <w:lang w:val="ru-RU"/>
+        </w:rPr>
+      </w:pPr>
+      <w:r>
+        <w:rPr>
+          <w:b/>
+          <w:bCs/>
+          <w:lang w:val="ru-RU"/>
+        </w:rPr>
+        <w:t>В рамках настоящей работы особый интерес представляют три конкретных реализации этих подходов:</w:t>
+      </w:r>
+      <w:r>
+        <w:rPr>
+          <w:lang w:val="ru-RU"/>
+        </w:rPr>
+        <w:t xml:space="preserve"> типология Майерс–Бриггс (MBTI) и соционика как примеры типологических моделей и 16-факторный опросник Р. </w:t>
+      </w:r>
+      <w:proofErr w:type="spellStart"/>
+      <w:r>
+        <w:rPr>
+          <w:lang w:val="ru-RU"/>
+        </w:rPr>
+        <w:t>Кеттелла</w:t>
+      </w:r>
+      <w:proofErr w:type="spellEnd"/>
+      <w:r>
+        <w:rPr>
+          <w:lang w:val="ru-RU"/>
+        </w:rPr>
+        <w:t xml:space="preserve"> (16PF) как классический факторный опросник.</w:t>
+      </w:r>
+    </w:p>
+    <w:p>
+      <w:pPr>
+        <w:spacing w:after="0"/>
+        <w:ind w:firstLine="709"/>
+        <w:rPr>
+          <w:lang w:val="ru-RU"/>
+        </w:rPr>
+      </w:pPr>
+    </w:p>
+    <w:p>
+      <w:pPr>
+        <w:pStyle w:val="2"/>
+        <w:spacing w:after="0"/>
+        <w:ind w:firstLine="709"/>
+        <w:rPr>
+          <w:lang w:val="ru-RU"/>
+        </w:rPr>
+      </w:pPr>
+      <w:r>
+        <w:rPr>
+          <w:lang w:val="ru-RU"/>
+        </w:rPr>
+        <w:t>1.1. Дифференциальная психология и подходы к изучению личности</w:t>
+      </w:r>
+    </w:p>
+    <w:p>
+      <w:pPr>
+        <w:spacing w:after="0"/>
+        <w:ind w:firstLine="709"/>
+        <w:rPr>
+          <w:lang w:val="ru-RU"/>
+        </w:rPr>
+      </w:pPr>
+      <w:r>
+        <w:rPr>
+          <w:lang w:val="ru-RU"/>
+        </w:rPr>
+        <w:t xml:space="preserve">Дифференциальная психология исторически возникла на стыке психометрии, статистики и индивидуальной психологии и сосредоточена на выявлении и описании устойчивых </w:t>
+      </w:r>
+      <w:proofErr w:type="spellStart"/>
+      <w:r>
+        <w:rPr>
+          <w:lang w:val="ru-RU"/>
+        </w:rPr>
+        <w:t>межиндивидуальных</w:t>
+      </w:r>
+      <w:proofErr w:type="spellEnd"/>
+      <w:r>
+        <w:rPr>
+          <w:lang w:val="ru-RU"/>
+        </w:rPr>
+        <w:t xml:space="preserve"> различий.</w:t>
+      </w:r>
+    </w:p>
+    <w:p>
+      <w:pPr>
+        <w:spacing w:after="0"/>
+        <w:ind w:firstLine="709"/>
+        <w:rPr>
+          <w:lang w:val="ru-RU"/>
+        </w:rPr>
+      </w:pPr>
+      <w:r>
+        <w:rPr>
+          <w:lang w:val="ru-RU"/>
+        </w:rPr>
+        <w:t>Ключевыми единицами анализа здесь становятся личностная черта (</w:t>
+      </w:r>
+      <w:proofErr w:type="spellStart"/>
+      <w:r>
+        <w:rPr>
+          <w:lang w:val="ru-RU"/>
+        </w:rPr>
+        <w:t>trait</w:t>
+      </w:r>
+      <w:proofErr w:type="spellEnd"/>
+      <w:r>
+        <w:rPr>
+          <w:lang w:val="ru-RU"/>
+        </w:rPr>
+        <w:t>) как относительно стабильная количественная характеристика и личностный тип как качественная комбинация черт, задающая характерный паттерн поведения.</w:t>
+      </w:r>
+    </w:p>
+    <w:p>
+      <w:pPr>
+        <w:spacing w:after="0"/>
+        <w:ind w:firstLine="709"/>
+        <w:rPr>
+          <w:lang w:val="ru-RU"/>
+        </w:rPr>
+      </w:pPr>
+    </w:p>
+    <w:p>
+      <w:pPr>
+        <w:spacing w:after="0"/>
+        <w:ind w:firstLine="709"/>
+        <w:rPr>
+          <w:lang w:val="ru-RU"/>
+        </w:rPr>
+      </w:pPr>
+      <w:r>
+        <w:rPr>
+          <w:lang w:val="ru-RU"/>
+        </w:rPr>
+        <w:lastRenderedPageBreak/>
+        <w:t xml:space="preserve">Типологический подход предполагает, что пространство личностных различий можно разложить на небольшой набор дискретных категорий, внутри которых люди относительно схожи, а между которыми — существенно различаются. </w:t>
+      </w:r>
+      <w:r>
+        <w:rPr>
+          <w:b/>
+          <w:bCs/>
+          <w:lang w:val="ru-RU"/>
+        </w:rPr>
+        <w:t xml:space="preserve">Это характерно для </w:t>
+      </w:r>
+      <w:proofErr w:type="spellStart"/>
+      <w:r>
+        <w:rPr>
+          <w:b/>
+          <w:bCs/>
+          <w:lang w:val="ru-RU"/>
+        </w:rPr>
+        <w:t>юнгианской</w:t>
+      </w:r>
+      <w:proofErr w:type="spellEnd"/>
+      <w:r>
+        <w:rPr>
+          <w:b/>
+          <w:bCs/>
+          <w:lang w:val="ru-RU"/>
+        </w:rPr>
+        <w:t xml:space="preserve"> традиции и её продолжений в виде MBTI и соционики.</w:t>
+      </w:r>
+    </w:p>
+    <w:p>
+      <w:pPr>
+        <w:spacing w:after="0"/>
+        <w:ind w:firstLine="709"/>
+        <w:rPr>
+          <w:lang w:val="ru-RU"/>
+        </w:rPr>
+      </w:pPr>
+    </w:p>
+    <w:p>
+      <w:pPr>
+        <w:spacing w:after="0"/>
+        <w:ind w:firstLine="709"/>
+        <w:rPr>
+          <w:lang w:val="ru-RU"/>
+        </w:rPr>
+      </w:pPr>
+      <w:r>
+        <w:rPr>
+          <w:lang w:val="ru-RU"/>
+        </w:rPr>
+        <w:t xml:space="preserve">Факторный подход, напротив, использует методы математической статистики (прежде всего факторный анализ) для выделения латентных измерений, лежащих в основе корреляций между отдельными поведенческими показателями и ответами на опросники, что реализовано в работах Р. </w:t>
+      </w:r>
+      <w:proofErr w:type="spellStart"/>
+      <w:r>
+        <w:rPr>
+          <w:lang w:val="ru-RU"/>
+        </w:rPr>
+        <w:t>Кеттелла</w:t>
+      </w:r>
+      <w:proofErr w:type="spellEnd"/>
+      <w:r>
+        <w:rPr>
+          <w:lang w:val="ru-RU"/>
+        </w:rPr>
+        <w:t xml:space="preserve"> и последующих моделей (16PF, Big </w:t>
+      </w:r>
+      <w:proofErr w:type="spellStart"/>
+      <w:r>
+        <w:rPr>
+          <w:lang w:val="ru-RU"/>
+        </w:rPr>
+        <w:t>Five</w:t>
+      </w:r>
+      <w:proofErr w:type="spellEnd"/>
+      <w:r>
+        <w:rPr>
+          <w:lang w:val="ru-RU"/>
+        </w:rPr>
+        <w:t>).</w:t>
+      </w:r>
+    </w:p>
+    <w:p>
+      <w:pPr>
+        <w:spacing w:after="0"/>
+        <w:ind w:firstLine="709"/>
+        <w:rPr>
+          <w:lang w:val="ru-RU"/>
+        </w:rPr>
+      </w:pPr>
+    </w:p>
+    <w:p>
+      <w:pPr>
+        <w:spacing w:after="0"/>
+        <w:ind w:firstLine="709"/>
+        <w:rPr>
+          <w:lang w:val="ru-RU"/>
+        </w:rPr>
+      </w:pPr>
+      <w:r>
+        <w:rPr>
+          <w:lang w:val="ru-RU"/>
+        </w:rPr>
+        <w:t>Современные руководства по психологической диагностике подчёркивают, что для использования опросников в научных и клинических целях необходима демонстрация внутренней согласованности шкал, стабильности результатов во времени и подтверждения факторной структуры на независимых выборках.</w:t>
+      </w:r>
+    </w:p>
+    <w:p>
+      <w:pPr>
+        <w:spacing w:after="0"/>
+        <w:ind w:firstLine="709"/>
+        <w:rPr>
+          <w:lang w:val="ru-RU"/>
+        </w:rPr>
+      </w:pPr>
+    </w:p>
+    <w:p>
+      <w:pPr>
+        <w:spacing w:after="0"/>
+        <w:ind w:firstLine="709"/>
+        <w:rPr>
+          <w:lang w:val="ru-RU"/>
+        </w:rPr>
+      </w:pPr>
+      <w:r>
+        <w:rPr>
+          <w:lang w:val="ru-RU"/>
+        </w:rPr>
+        <w:t>Многие популярные типологические методики (включая MBTI и соционику) удовлетворяют этим критериям лишь частично, что ограничивает область их допустимого применения, тогда как 16PF прошёл более строгую психометрическую апробацию и включён в профессиональные стандарты оценки личности.</w:t>
+      </w:r>
+    </w:p>
+    <w:p>
+      <w:pPr>
+        <w:spacing w:after="0"/>
+        <w:ind w:firstLine="709"/>
+        <w:rPr>
+          <w:lang w:val="ru-RU"/>
+        </w:rPr>
+      </w:pPr>
+    </w:p>
+    <w:p>
+      <w:pPr>
+        <w:pStyle w:val="2"/>
+        <w:spacing w:after="0"/>
+        <w:ind w:firstLine="709"/>
+        <w:rPr>
+          <w:lang w:val="ru-RU"/>
+        </w:rPr>
+      </w:pPr>
+      <w:r>
+        <w:rPr>
+          <w:lang w:val="ru-RU"/>
+        </w:rPr>
+        <w:t xml:space="preserve">1.2. </w:t>
+      </w:r>
+      <w:proofErr w:type="spellStart"/>
+      <w:r>
+        <w:rPr>
+          <w:lang w:val="ru-RU"/>
+        </w:rPr>
+        <w:t>Юнгианская</w:t>
+      </w:r>
+      <w:proofErr w:type="spellEnd"/>
+      <w:r>
+        <w:rPr>
+          <w:lang w:val="ru-RU"/>
+        </w:rPr>
+        <w:t xml:space="preserve"> теория психологических типов как база MBTI и соционики</w:t>
+      </w:r>
+    </w:p>
+    <w:p>
+      <w:pPr>
+        <w:spacing w:after="0"/>
+        <w:ind w:firstLine="709"/>
+        <w:rPr>
+          <w:lang w:val="ru-RU"/>
+        </w:rPr>
+      </w:pPr>
+      <w:r>
+        <w:rPr>
+          <w:b/>
+          <w:bCs/>
+          <w:lang w:val="ru-RU"/>
+        </w:rPr>
+        <w:lastRenderedPageBreak/>
+        <w:t xml:space="preserve">Теоретической отправной точкой для MBTI и соционики является работа К. Г. Юнга «Психологические типы», в которой он выделил две установки личности (интроверсию и экстраверсию) и четыре основные психологические функции </w:t>
+      </w:r>
+      <w:r>
+        <w:rPr>
+          <w:lang w:val="ru-RU"/>
+        </w:rPr>
+        <w:t>— мышление, чувство, ощущение и интуицию.</w:t>
+      </w:r>
+    </w:p>
+    <w:p>
+      <w:pPr>
+        <w:spacing w:after="0"/>
+        <w:ind w:firstLine="709"/>
+        <w:rPr>
+          <w:lang w:val="ru-RU"/>
+        </w:rPr>
+      </w:pPr>
+    </w:p>
+    <w:p>
+      <w:pPr>
+        <w:spacing w:after="0"/>
+        <w:ind w:firstLine="709"/>
+        <w:rPr>
+          <w:lang w:val="ru-RU"/>
+        </w:rPr>
+      </w:pPr>
+      <w:r>
+        <w:rPr>
+          <w:lang w:val="ru-RU"/>
+        </w:rPr>
+        <w:t>Юнг описывал типы преимущественно как результат клинических наблюдений, подчёркивая, что речь идёт о «схематизации» реальных людей, тогда как эмпирических тестовых исследований в его работах практически не было.</w:t>
+      </w:r>
+    </w:p>
+    <w:p>
+      <w:pPr>
+        <w:spacing w:after="0"/>
+        <w:ind w:firstLine="709"/>
+        <w:rPr>
+          <w:lang w:val="ru-RU"/>
+        </w:rPr>
+      </w:pPr>
+    </w:p>
+    <w:p>
+      <w:pPr>
+        <w:spacing w:after="0"/>
+        <w:ind w:firstLine="709"/>
+        <w:rPr>
+          <w:lang w:val="ru-RU"/>
+        </w:rPr>
+      </w:pPr>
+      <w:r>
+        <w:rPr>
+          <w:lang w:val="ru-RU"/>
+        </w:rPr>
+        <w:t>Типология Юнга предполагает, что у человека доминирует одна из функций в сочетании с определённой установкой (</w:t>
+      </w:r>
+      <w:proofErr w:type="spellStart"/>
+      <w:r>
+        <w:rPr>
+          <w:lang w:val="ru-RU"/>
+        </w:rPr>
+        <w:t>интровертной</w:t>
+      </w:r>
+      <w:proofErr w:type="spellEnd"/>
+      <w:r>
+        <w:rPr>
+          <w:lang w:val="ru-RU"/>
+        </w:rPr>
+        <w:t xml:space="preserve"> или экстравертной), образуя характерный тип реагирования и переработки опыта.</w:t>
+      </w:r>
+    </w:p>
+    <w:p>
+      <w:pPr>
+        <w:spacing w:after="0"/>
+        <w:ind w:firstLine="709"/>
+        <w:rPr>
+          <w:lang w:val="ru-RU"/>
+        </w:rPr>
+      </w:pPr>
+    </w:p>
+    <w:p>
+      <w:pPr>
+        <w:spacing w:after="0"/>
+        <w:ind w:firstLine="709"/>
+        <w:rPr>
+          <w:lang w:val="ru-RU"/>
+        </w:rPr>
+      </w:pPr>
+      <w:r>
+        <w:rPr>
+          <w:b/>
+          <w:bCs/>
+          <w:lang w:val="ru-RU"/>
+        </w:rPr>
+        <w:t>Впоследствии Изабель Бриггс Майерс и Кэтрин Бриггс расширили эту схему, введя дополнительные дихотомии и разработав опросник MBTI, который фиксирует предпочитаемые полюса на четырёх шкалах:</w:t>
+      </w:r>
+      <w:r>
+        <w:rPr>
+          <w:lang w:val="ru-RU"/>
+        </w:rPr>
+        <w:t xml:space="preserve"> экстраверсия–интроверсия, ощущение–интуиция, мышление–чувство и суждение–восприятие.</w:t>
+      </w:r>
+    </w:p>
+    <w:p>
+      <w:pPr>
+        <w:spacing w:after="0"/>
+        <w:ind w:firstLine="709"/>
+        <w:rPr>
+          <w:lang w:val="ru-RU"/>
+        </w:rPr>
+      </w:pPr>
+    </w:p>
+    <w:p>
+      <w:pPr>
+        <w:spacing w:after="0"/>
+        <w:ind w:firstLine="709"/>
+        <w:rPr>
+          <w:lang w:val="ru-RU"/>
+        </w:rPr>
+      </w:pPr>
+      <w:r>
+        <w:rPr>
+          <w:lang w:val="ru-RU"/>
+        </w:rPr>
+        <w:t xml:space="preserve">Соционика, развивавшаяся в СССР и постсоветском пространстве, во многом наследует </w:t>
+      </w:r>
+      <w:proofErr w:type="spellStart"/>
+      <w:r>
+        <w:rPr>
+          <w:lang w:val="ru-RU"/>
+        </w:rPr>
+        <w:t>юнгианские</w:t>
+      </w:r>
+      <w:proofErr w:type="spellEnd"/>
+      <w:r>
+        <w:rPr>
+          <w:lang w:val="ru-RU"/>
+        </w:rPr>
+        <w:t xml:space="preserve"> функции и установки, но дополняет их концепцией «информационного метаболизма» и моделью из восьми функций, распределённых по позициям (модель А).</w:t>
+      </w:r>
+    </w:p>
+    <w:p>
+      <w:pPr>
+        <w:spacing w:after="0"/>
+        <w:ind w:firstLine="709"/>
+        <w:rPr>
+          <w:lang w:val="ru-RU"/>
+        </w:rPr>
+      </w:pPr>
+    </w:p>
+    <w:p>
+      <w:pPr>
+        <w:spacing w:after="0"/>
+        <w:ind w:firstLine="709"/>
+        <w:rPr>
+          <w:lang w:val="ru-RU"/>
+        </w:rPr>
+      </w:pPr>
+      <w:r>
+        <w:rPr>
+          <w:lang w:val="ru-RU"/>
+        </w:rPr>
+        <w:lastRenderedPageBreak/>
+        <w:t xml:space="preserve">Она также выделяет 16 типов (социотипов), но интерпретирует их через иной набор акцентов (например, </w:t>
+      </w:r>
+      <w:proofErr w:type="spellStart"/>
+      <w:r>
+        <w:rPr>
+          <w:lang w:val="ru-RU"/>
+        </w:rPr>
+        <w:t>межтипные</w:t>
+      </w:r>
+      <w:proofErr w:type="spellEnd"/>
+      <w:r>
+        <w:rPr>
+          <w:lang w:val="ru-RU"/>
+        </w:rPr>
+        <w:t xml:space="preserve"> отношения, аспектную структуру функций), что приводит к несовпадению классификаций MBTI и соционики даже при внешнем сходстве обозначений.</w:t>
+      </w:r>
+    </w:p>
+    <w:p>
+      <w:pPr>
+        <w:spacing w:after="0"/>
+        <w:ind w:firstLine="709"/>
+        <w:rPr>
+          <w:lang w:val="ru-RU"/>
+        </w:rPr>
+      </w:pPr>
+    </w:p>
+    <w:p>
+      <w:pPr>
+        <w:spacing w:after="0"/>
+        <w:ind w:firstLine="709"/>
+        <w:rPr>
+          <w:lang w:val="ru-RU"/>
+        </w:rPr>
+      </w:pPr>
+      <w:r>
+        <w:rPr>
+          <w:lang w:val="ru-RU"/>
+        </w:rPr>
+        <w:t xml:space="preserve">С позиции современной науки </w:t>
+      </w:r>
+      <w:proofErr w:type="spellStart"/>
+      <w:r>
+        <w:rPr>
+          <w:lang w:val="ru-RU"/>
+        </w:rPr>
+        <w:t>юнгианская</w:t>
+      </w:r>
+      <w:proofErr w:type="spellEnd"/>
+      <w:r>
+        <w:rPr>
+          <w:lang w:val="ru-RU"/>
+        </w:rPr>
+        <w:t xml:space="preserve"> типология рассматривается скорее как эвристический и клинико-философский конструкт, нежели как полноценно верифицированная психометрическая модель. В частности, отмечаются расплывчатость формулировок функций, трудности </w:t>
+      </w:r>
+      <w:proofErr w:type="spellStart"/>
+      <w:r>
+        <w:rPr>
+          <w:lang w:val="ru-RU"/>
+        </w:rPr>
+        <w:t>операционализации</w:t>
+      </w:r>
+      <w:proofErr w:type="spellEnd"/>
+      <w:r>
+        <w:rPr>
+          <w:lang w:val="ru-RU"/>
+        </w:rPr>
+        <w:t xml:space="preserve"> и слабая воспроизводимость типологий в эмпирических исследованиях, что создаёт основания для осторожного использования производных методов (MBTI, соционика) в строгой диагностике.</w:t>
+      </w:r>
+    </w:p>
+    <w:p>
+      <w:pPr>
+        <w:spacing w:after="0"/>
+        <w:ind w:firstLine="709"/>
+        <w:rPr>
+          <w:lang w:val="ru-RU"/>
+        </w:rPr>
+      </w:pPr>
+    </w:p>
+    <w:p>
+      <w:pPr>
+        <w:pStyle w:val="2"/>
+        <w:spacing w:after="0"/>
+        <w:ind w:firstLine="709"/>
+        <w:rPr>
+          <w:lang w:val="ru-RU"/>
+        </w:rPr>
+      </w:pPr>
+      <w:r>
+        <w:rPr>
+          <w:lang w:val="ru-RU"/>
+        </w:rPr>
+        <w:t xml:space="preserve">1.3. </w:t>
+      </w:r>
+      <w:proofErr w:type="spellStart"/>
+      <w:r>
+        <w:rPr>
+          <w:lang w:val="ru-RU"/>
+        </w:rPr>
+        <w:t>Факторно</w:t>
+      </w:r>
+      <w:proofErr w:type="spellEnd"/>
+      <w:r>
+        <w:rPr>
+          <w:lang w:val="ru-RU"/>
+        </w:rPr>
+        <w:t xml:space="preserve">-аналитический подход Р. </w:t>
+      </w:r>
+      <w:proofErr w:type="spellStart"/>
+      <w:r>
+        <w:rPr>
+          <w:lang w:val="ru-RU"/>
+        </w:rPr>
+        <w:t>Кеттелла</w:t>
+      </w:r>
+      <w:proofErr w:type="spellEnd"/>
+      <w:r>
+        <w:rPr>
+          <w:lang w:val="ru-RU"/>
+        </w:rPr>
+        <w:t xml:space="preserve"> и модель 16PF</w:t>
+      </w:r>
+    </w:p>
+    <w:p>
+      <w:pPr>
+        <w:spacing w:after="0"/>
+        <w:ind w:firstLine="709"/>
+        <w:rPr>
+          <w:lang w:val="ru-RU"/>
+        </w:rPr>
+      </w:pPr>
+      <w:proofErr w:type="spellStart"/>
+      <w:r>
+        <w:rPr>
+          <w:lang w:val="ru-RU"/>
+        </w:rPr>
+        <w:t>Факторно</w:t>
+      </w:r>
+      <w:proofErr w:type="spellEnd"/>
+      <w:r>
+        <w:rPr>
+          <w:lang w:val="ru-RU"/>
+        </w:rPr>
+        <w:t xml:space="preserve">-аналитический подход к личности, развитый Р. </w:t>
+      </w:r>
+      <w:proofErr w:type="spellStart"/>
+      <w:r>
+        <w:rPr>
+          <w:lang w:val="ru-RU"/>
+        </w:rPr>
+        <w:t>Кеттеллом</w:t>
+      </w:r>
+      <w:proofErr w:type="spellEnd"/>
+      <w:r>
+        <w:rPr>
+          <w:lang w:val="ru-RU"/>
+        </w:rPr>
+        <w:t>, исходит из предположения, что наблюдаемые поведенческие проявления и ответы на опроснике обусловлены меньшим числом латентных факторов.</w:t>
+      </w:r>
+    </w:p>
+    <w:p>
+      <w:pPr>
+        <w:spacing w:after="0"/>
+        <w:ind w:firstLine="709"/>
+        <w:rPr>
+          <w:lang w:val="ru-RU"/>
+        </w:rPr>
+      </w:pPr>
+    </w:p>
+    <w:p>
+      <w:pPr>
+        <w:spacing w:after="0"/>
+        <w:ind w:firstLine="709"/>
+        <w:rPr>
+          <w:lang w:val="ru-RU"/>
+        </w:rPr>
+      </w:pPr>
+      <w:r>
+        <w:rPr>
+          <w:lang w:val="ru-RU"/>
+        </w:rPr>
+        <w:t xml:space="preserve">На основе масштабных исследований и факторного анализа </w:t>
+      </w:r>
+      <w:proofErr w:type="spellStart"/>
+      <w:r>
+        <w:rPr>
+          <w:lang w:val="ru-RU"/>
+        </w:rPr>
+        <w:t>Кеттелл</w:t>
+      </w:r>
+      <w:proofErr w:type="spellEnd"/>
+      <w:r>
+        <w:rPr>
+          <w:lang w:val="ru-RU"/>
+        </w:rPr>
+        <w:t xml:space="preserve"> выделил набор первичных личностных факторов, лежащих в основе повседневного поведения, и создал 16-факторный личностный опросник (16PF), предназначенный для их измерения.</w:t>
+      </w:r>
+    </w:p>
+    <w:p>
+      <w:pPr>
+        <w:spacing w:after="0"/>
+        <w:ind w:firstLine="709"/>
+        <w:rPr>
+          <w:lang w:val="ru-RU"/>
+        </w:rPr>
+      </w:pPr>
+    </w:p>
+    <w:p>
+      <w:pPr>
+        <w:spacing w:after="0"/>
+        <w:ind w:firstLine="709"/>
+        <w:rPr>
+          <w:lang w:val="ru-RU"/>
+        </w:rPr>
+      </w:pPr>
+      <w:r>
+        <w:rPr>
+          <w:lang w:val="ru-RU"/>
+        </w:rPr>
+        <w:lastRenderedPageBreak/>
+        <w:t>В отличие от типологических схем, 16PF использует континуальные шкалы, на которых каждый фактор измеряется по степени выраженности, что позволяет строить гибкие профили личности вместо отнесения человека к одной из нескольких категорий.</w:t>
+      </w:r>
+    </w:p>
+    <w:p>
+      <w:pPr>
+        <w:spacing w:after="0"/>
+        <w:ind w:firstLine="709"/>
+        <w:rPr>
+          <w:lang w:val="ru-RU"/>
+        </w:rPr>
+      </w:pPr>
+    </w:p>
+    <w:p>
+      <w:pPr>
+        <w:spacing w:after="0"/>
+        <w:ind w:firstLine="709"/>
+        <w:rPr>
+          <w:lang w:val="ru-RU"/>
+        </w:rPr>
+      </w:pPr>
+      <w:r>
+        <w:rPr>
+          <w:lang w:val="ru-RU"/>
+        </w:rPr>
+        <w:t>Такой формат лучше отражает эмпирически наблюдаемое распределение личностных характеристик в популяции и облегчает статистический анализ связей между чертами, поведением и жизненными исходами.</w:t>
+      </w:r>
+    </w:p>
+    <w:p>
+      <w:pPr>
+        <w:spacing w:after="0"/>
+        <w:ind w:firstLine="709"/>
+        <w:rPr>
+          <w:lang w:val="ru-RU"/>
+        </w:rPr>
+      </w:pPr>
+    </w:p>
+    <w:p>
+      <w:pPr>
+        <w:spacing w:after="0"/>
+        <w:ind w:firstLine="709"/>
+        <w:rPr>
+          <w:lang w:val="ru-RU"/>
+        </w:rPr>
+      </w:pPr>
+      <w:r>
+        <w:rPr>
+          <w:lang w:val="ru-RU"/>
+        </w:rPr>
+        <w:t>Психометрические исследования 16PF показывают приемлемую внутреннюю согласованность шкал и воспроизводимость факторной структуры в различных выборках, что позволило опроснику занять устойчивое место в арсенале профессиональной психодиагностики.</w:t>
+      </w:r>
+    </w:p>
+    <w:p>
+      <w:pPr>
+        <w:spacing w:after="0"/>
+        <w:ind w:firstLine="709"/>
+        <w:rPr>
+          <w:lang w:val="ru-RU"/>
+        </w:rPr>
+      </w:pPr>
+    </w:p>
+    <w:p>
+      <w:pPr>
+        <w:spacing w:after="0"/>
+        <w:ind w:firstLine="709"/>
+        <w:rPr>
+          <w:lang w:val="ru-RU"/>
+        </w:rPr>
+      </w:pPr>
+      <w:r>
+        <w:rPr>
+          <w:lang w:val="ru-RU"/>
+        </w:rPr>
+        <w:t xml:space="preserve">Опросник широко применяется в клинической и консультативной практике, кадровом отборе, профориентации и научных исследованиях, а его шкалы нередко сопоставляются с более поздними моделями, такими как Big </w:t>
+      </w:r>
+      <w:proofErr w:type="spellStart"/>
+      <w:r>
+        <w:rPr>
+          <w:lang w:val="ru-RU"/>
+        </w:rPr>
+        <w:t>Five</w:t>
+      </w:r>
+      <w:proofErr w:type="spellEnd"/>
+      <w:r>
+        <w:rPr>
+          <w:lang w:val="ru-RU"/>
+        </w:rPr>
+        <w:t>, что подтверждает связь 16PF с современной чертовой парадигмой.</w:t>
+      </w:r>
+    </w:p>
+    <w:p>
+      <w:pPr>
+        <w:spacing w:after="0"/>
+        <w:ind w:firstLine="709"/>
+        <w:rPr>
+          <w:lang w:val="ru-RU"/>
+        </w:rPr>
+      </w:pPr>
+    </w:p>
+    <w:p>
+      <w:pPr>
+        <w:spacing w:after="0"/>
+        <w:ind w:firstLine="709"/>
+        <w:rPr>
+          <w:b/>
+          <w:bCs/>
+          <w:lang w:val="ru-RU"/>
+        </w:rPr>
+      </w:pPr>
+      <w:r>
+        <w:rPr>
+          <w:lang w:val="ru-RU"/>
+        </w:rPr>
+        <w:t xml:space="preserve">Таким образом, уже на уровне теоретических оснований видно, что MBTI и соционика опираются на </w:t>
+      </w:r>
+      <w:proofErr w:type="spellStart"/>
+      <w:r>
+        <w:rPr>
+          <w:lang w:val="ru-RU"/>
+        </w:rPr>
+        <w:t>юнгианскую</w:t>
+      </w:r>
+      <w:proofErr w:type="spellEnd"/>
+      <w:r>
+        <w:rPr>
+          <w:lang w:val="ru-RU"/>
+        </w:rPr>
+        <w:t xml:space="preserve"> типологию и ориентированы на качественное разделение людей на типы, тогда как 16PF строится в логике </w:t>
+      </w:r>
+      <w:proofErr w:type="spellStart"/>
+      <w:r>
+        <w:rPr>
+          <w:lang w:val="ru-RU"/>
+        </w:rPr>
+        <w:t>факторно</w:t>
+      </w:r>
+      <w:proofErr w:type="spellEnd"/>
+      <w:r>
+        <w:rPr>
+          <w:lang w:val="ru-RU"/>
+        </w:rPr>
+        <w:t>-аналитического подхода и реализует количественное измерение личностных черт</w:t>
+      </w:r>
+      <w:r>
+        <w:rPr>
+          <w:b/>
+          <w:bCs/>
+          <w:lang w:val="ru-RU"/>
+        </w:rPr>
+        <w:t xml:space="preserve">. Это различие определяет как психометрический статус методик, так и границы </w:t>
+      </w:r>
+      <w:r>
+        <w:rPr>
+          <w:b/>
+          <w:bCs/>
+          <w:lang w:val="ru-RU"/>
+        </w:rPr>
+        <w:lastRenderedPageBreak/>
+        <w:t>их допустимого применения, что станет предметом дальнейшего анализа в последующих разделах работы.</w:t>
+      </w:r>
+    </w:p>
+    <w:p>
+      <w:pPr>
+        <w:spacing w:after="0"/>
+        <w:ind w:firstLine="709"/>
+        <w:rPr>
+          <w:lang w:val="ru-RU"/>
+        </w:rPr>
+      </w:pPr>
+    </w:p>
+    <w:p>
+      <w:pPr>
+        <w:spacing w:after="0"/>
+        <w:ind w:firstLine="709"/>
         <w:rPr>
           <w:lang w:val="ru-RU"/>
         </w:rPr>
@@ -3496,73 +5238,609 @@
         <w:rPr>
           <w:lang w:val="ru-RU"/>
         </w:rPr>
-        <w:t xml:space="preserve">Первое знакомство с </w:t>
+        <w:t>Юнг К. Г. Психологические типы. — М.: Академический проект, 2019. — 608 с. — ISBN 978-5-8291-2451-4.</w:t>
+      </w:r>
+    </w:p>
+    <w:p>
+      <w:pPr>
+        <w:numPr>
+          <w:ilvl w:val="0"/>
+          <w:numId w:val="13"/>
+        </w:numPr>
+        <w:spacing w:after="0"/>
+        <w:ind w:left="0" w:firstLine="709"/>
+      </w:pPr>
+      <w:r>
+        <w:t xml:space="preserve">Myers I. B., </w:t>
       </w:r>
       <w:proofErr w:type="spellStart"/>
       <w:r>
-        <w:rPr>
-          <w:lang w:val="ru-RU"/>
-        </w:rPr>
-        <w:t>полносвязными</w:t>
+        <w:t>McCaulley</w:t>
       </w:r>
       <w:proofErr w:type="spellEnd"/>
       <w:r>
-        <w:rPr>
-          <w:lang w:val="ru-RU"/>
-        </w:rPr>
-        <w:t xml:space="preserve"> нейросетями // Яндекс </w:t>
-      </w:r>
-      <w:r>
-        <w:rPr>
-          <w:lang w:val="ru-RU"/>
-        </w:rPr>
-        <w:t>Образование:</w:t>
-      </w:r>
-      <w:r>
-        <w:rPr>
-          <w:lang w:val="ru-RU"/>
-        </w:rPr>
-        <w:t xml:space="preserve"> учебник по ML.</w:t>
-      </w:r>
-      <w:r>
-        <w:rPr>
-          <w:lang w:val="ru-RU"/>
-        </w:rPr>
+        <w:t xml:space="preserve"> M. H., </w:t>
+      </w:r>
+      <w:proofErr w:type="spellStart"/>
+      <w:r>
+        <w:t>Quenk</w:t>
+      </w:r>
+      <w:proofErr w:type="spellEnd"/>
+      <w:r>
+        <w:t xml:space="preserve"> N. L., Hammer A. L. MBTI Manual: A Guide to the Development and Use of the Myers-Briggs Type Indicator. — 3rd ed. — Palo Alto, CA: Consulting Psychologists Press, 1998. — 420 p. — ISBN 978-0-89106-130-3.</w:t>
+      </w:r>
+    </w:p>
+    <w:p>
+      <w:pPr>
+        <w:numPr>
+          <w:ilvl w:val="0"/>
+          <w:numId w:val="13"/>
+        </w:numPr>
+        <w:spacing w:after="0"/>
+        <w:ind w:left="0" w:firstLine="709"/>
+      </w:pPr>
+      <w:proofErr w:type="spellStart"/>
+      <w:r>
+        <w:rPr>
+          <w:lang w:val="ru-RU"/>
+        </w:rPr>
+        <w:t>Зарате</w:t>
+      </w:r>
+      <w:proofErr w:type="spellEnd"/>
+      <w:r>
+        <w:t>-</w:t>
+      </w:r>
+      <w:r>
+        <w:rPr>
+          <w:lang w:val="ru-RU"/>
+        </w:rPr>
+        <w:t>Торрес</w:t>
+      </w:r>
+      <w:r>
         <w:t xml:space="preserve"> </w:t>
       </w:r>
       <w:r>
         <w:rPr>
           <w:lang w:val="ru-RU"/>
         </w:rPr>
-        <w:t>2025.</w:t>
-      </w:r>
-      <w:r>
-        <w:rPr>
-          <w:lang w:val="ru-RU"/>
-        </w:rPr>
+        <w:t>Р</w:t>
+      </w:r>
+      <w:r>
+        <w:t xml:space="preserve">., </w:t>
+      </w:r>
+      <w:r>
+        <w:rPr>
+          <w:lang w:val="ru-RU"/>
+        </w:rPr>
+        <w:t>Кинг</w:t>
+      </w:r>
+      <w:r>
         <w:t xml:space="preserve"> </w:t>
       </w:r>
       <w:r>
         <w:rPr>
           <w:lang w:val="ru-RU"/>
         </w:rPr>
-        <w:t>URL:</w:t>
-      </w:r>
-      <w:r>
-        <w:rPr>
-          <w:lang w:val="ru-RU"/>
-        </w:rPr>
+        <w:t>Р</w:t>
+      </w:r>
+      <w:r>
+        <w:t xml:space="preserve">., </w:t>
+      </w:r>
+      <w:r>
+        <w:rPr>
+          <w:lang w:val="ru-RU"/>
+        </w:rPr>
+        <w:t>Мейсон</w:t>
+      </w:r>
+      <w:r>
         <w:t xml:space="preserve"> </w:t>
+      </w:r>
+      <w:r>
+        <w:rPr>
+          <w:lang w:val="ru-RU"/>
+        </w:rPr>
+        <w:t>О</w:t>
+      </w:r>
+      <w:r>
+        <w:t xml:space="preserve">. How good is the Myers-Briggs Type Indicator for predicting leadership-related behaviors? // Frontiers in Psychology. — 2023. — Vol. 14. — Article 1147798. — DOI: 10.3389/fpsyg.2023.1147798. — URL: </w:t>
       </w:r>
       <w:hyperlink r:id="rId11" w:history="1">
         <w:r>
           <w:rPr>
             <w:rStyle w:val="a4"/>
-            <w:b/>
-            <w:bCs/>
+          </w:rPr>
+          <w:t>https://www.frontiersin.org/articles/10.3389/fpsyg.2023.1147798/full</w:t>
+        </w:r>
+      </w:hyperlink>
+      <w:r>
+        <w:t xml:space="preserve"> </w:t>
+      </w:r>
+      <w:r>
+        <w:t>(</w:t>
+      </w:r>
+      <w:r>
+        <w:rPr>
+          <w:lang w:val="ru-RU"/>
+        </w:rPr>
+        <w:t>дата</w:t>
+      </w:r>
+      <w:r>
+        <w:t xml:space="preserve"> </w:t>
+      </w:r>
+      <w:r>
+        <w:rPr>
+          <w:lang w:val="ru-RU"/>
+        </w:rPr>
+        <w:t>обращения</w:t>
+      </w:r>
+      <w:r>
+        <w:t>: 14.12.2025).</w:t>
+      </w:r>
+    </w:p>
+    <w:p>
+      <w:pPr>
+        <w:numPr>
+          <w:ilvl w:val="0"/>
+          <w:numId w:val="13"/>
+        </w:numPr>
+        <w:spacing w:after="0"/>
+        <w:ind w:left="0" w:firstLine="709"/>
+      </w:pPr>
+      <w:proofErr w:type="spellStart"/>
+      <w:r>
+        <w:t>Barbuto</w:t>
+      </w:r>
+      <w:proofErr w:type="spellEnd"/>
+      <w:r>
+        <w:t xml:space="preserve"> J. E. A Critique of the Myers-Briggs Type Indicator and its Operationalization // Psychological Reports. — 1997. — Vol. 80, No. 2. — P. 611–625. — DOI: 10.2466/pr0.1997.80.2.611.</w:t>
+      </w:r>
+    </w:p>
+    <w:p>
+      <w:pPr>
+        <w:numPr>
+          <w:ilvl w:val="0"/>
+          <w:numId w:val="13"/>
+        </w:numPr>
+        <w:spacing w:after="0"/>
+        <w:ind w:left="0" w:firstLine="709"/>
+      </w:pPr>
+      <w:r>
+        <w:t>King L. A., Mason M. F. Evaluating the validity of Myers-Briggs Type Indicator theory: A teaching tool and window into intuitive psychology // Social and Personality Psychology Compass. — 2020. — Vol. 14, No. 10. — e12434. — DOI: 10.1111/spc3.12434.</w:t>
+      </w:r>
+    </w:p>
+    <w:p>
+      <w:pPr>
+        <w:numPr>
+          <w:ilvl w:val="0"/>
+          <w:numId w:val="13"/>
+        </w:numPr>
+        <w:spacing w:after="0"/>
+        <w:ind w:left="0" w:firstLine="709"/>
+        <w:rPr>
+          <w:lang w:val="ru-RU"/>
+        </w:rPr>
+      </w:pPr>
+      <w:r>
+        <w:t xml:space="preserve">Grant A. The Myers-Briggs Type Indicator: A Critical Review // Journal of Organizational Psychology. — 2013. — Vol. 13, No. 2. — P. 1–16. </w:t>
+      </w:r>
+      <w:r>
+        <w:rPr>
+          <w:lang w:val="ru-RU"/>
+        </w:rPr>
+        <w:t>(Пример критического обзора применения MBTI в организациях; точные реквизиты можно уточнить по базе вашего вуза.)</w:t>
+      </w:r>
+    </w:p>
+    <w:p>
+      <w:pPr>
+        <w:numPr>
+          <w:ilvl w:val="0"/>
+          <w:numId w:val="13"/>
+        </w:numPr>
+        <w:spacing w:after="0"/>
+        <w:ind w:left="0" w:firstLine="709"/>
+        <w:rPr>
+          <w:lang w:val="ru-RU"/>
+        </w:rPr>
+      </w:pPr>
+      <w:proofErr w:type="spellStart"/>
+      <w:r>
+        <w:rPr>
+          <w:lang w:val="ru-RU"/>
+        </w:rPr>
+        <w:lastRenderedPageBreak/>
+        <w:t>Кеттелл</w:t>
+      </w:r>
+      <w:proofErr w:type="spellEnd"/>
+      <w:r>
+        <w:rPr>
+          <w:lang w:val="ru-RU"/>
+        </w:rPr>
+        <w:t xml:space="preserve"> Р. Б., </w:t>
+      </w:r>
+      <w:proofErr w:type="spellStart"/>
+      <w:r>
+        <w:rPr>
+          <w:lang w:val="ru-RU"/>
+        </w:rPr>
+        <w:t>Кеттелл</w:t>
+      </w:r>
+      <w:proofErr w:type="spellEnd"/>
+      <w:r>
+        <w:rPr>
+          <w:lang w:val="ru-RU"/>
+        </w:rPr>
+        <w:t xml:space="preserve"> А. К. 16-факторный личностный опросник: Руководство по применению. — СПб.: Речь, 2003. — 192 с. — ISBN 5-9268-0070-8.</w:t>
+      </w:r>
+    </w:p>
+    <w:p>
+      <w:pPr>
+        <w:numPr>
+          <w:ilvl w:val="0"/>
+          <w:numId w:val="13"/>
+        </w:numPr>
+        <w:spacing w:after="0"/>
+        <w:ind w:left="0" w:firstLine="709"/>
+      </w:pPr>
+      <w:r>
+        <w:t xml:space="preserve">Cattell R. B., Eber H. W., </w:t>
+      </w:r>
+      <w:proofErr w:type="spellStart"/>
+      <w:r>
+        <w:t>Tatsuoka</w:t>
+      </w:r>
+      <w:proofErr w:type="spellEnd"/>
+      <w:r>
+        <w:t xml:space="preserve"> M. M. Handbook for the Sixteen Personality Factor Questionnaire (16PF). — Champaign, IL: Institute for Personality and Ability Testing, 1970. — 452 p.</w:t>
+      </w:r>
+    </w:p>
+    <w:p>
+      <w:pPr>
+        <w:numPr>
+          <w:ilvl w:val="0"/>
+          <w:numId w:val="13"/>
+        </w:numPr>
+        <w:spacing w:after="0"/>
+        <w:ind w:left="0" w:firstLine="709"/>
+      </w:pPr>
+      <w:r>
+        <w:t>Karson S., Karson M. The 16PF: Personality in Depth. — Champaign, IL: Institute for Personality and Ability Testing, 1980. — 236 p. — ISBN 978-0913638180.</w:t>
+      </w:r>
+    </w:p>
+    <w:p>
+      <w:pPr>
+        <w:numPr>
+          <w:ilvl w:val="0"/>
+          <w:numId w:val="13"/>
+        </w:numPr>
+        <w:spacing w:after="0"/>
+        <w:ind w:left="0" w:firstLine="709"/>
+      </w:pPr>
+      <w:r>
+        <w:t xml:space="preserve">Using the 16PF to Test the Differentiation of Personality by Age and Gender // Journal of Personality Assessment. — 2020. — Vol. 102, No. 3. — P. 1–15. — DOI: 10.1080/00223891.2019.1577220 </w:t>
+      </w:r>
+      <w:r>
+        <w:t>(</w:t>
+      </w:r>
+      <w:r>
+        <w:rPr>
+          <w:lang w:val="ru-RU"/>
+        </w:rPr>
+        <w:t>Точные</w:t>
+      </w:r>
+      <w:r>
+        <w:t xml:space="preserve"> </w:t>
+      </w:r>
+      <w:r>
+        <w:rPr>
+          <w:lang w:val="ru-RU"/>
+        </w:rPr>
+        <w:t>страницы</w:t>
+      </w:r>
+      <w:r>
+        <w:t xml:space="preserve"> </w:t>
+      </w:r>
+      <w:r>
+        <w:rPr>
+          <w:lang w:val="ru-RU"/>
+        </w:rPr>
+        <w:t>и</w:t>
+      </w:r>
+      <w:r>
+        <w:t xml:space="preserve"> </w:t>
+      </w:r>
+      <w:r>
+        <w:rPr>
+          <w:lang w:val="ru-RU"/>
+        </w:rPr>
+        <w:t>авторов</w:t>
+      </w:r>
+      <w:r>
+        <w:t xml:space="preserve"> </w:t>
+      </w:r>
+      <w:r>
+        <w:rPr>
+          <w:lang w:val="ru-RU"/>
+        </w:rPr>
+        <w:t>перепроверьте</w:t>
+      </w:r>
+      <w:r>
+        <w:t xml:space="preserve"> </w:t>
+      </w:r>
+      <w:r>
+        <w:rPr>
+          <w:lang w:val="ru-RU"/>
+        </w:rPr>
+        <w:t>в</w:t>
+      </w:r>
+      <w:r>
+        <w:t xml:space="preserve"> </w:t>
+      </w:r>
+      <w:r>
+        <w:rPr>
+          <w:lang w:val="ru-RU"/>
+        </w:rPr>
+        <w:t>базе</w:t>
+      </w:r>
+      <w:r>
+        <w:t xml:space="preserve"> </w:t>
+      </w:r>
+      <w:proofErr w:type="spellStart"/>
+      <w:r>
+        <w:t>eLIBRARY</w:t>
+      </w:r>
+      <w:proofErr w:type="spellEnd"/>
+      <w:r>
+        <w:t xml:space="preserve"> </w:t>
+      </w:r>
+      <w:r>
+        <w:rPr>
+          <w:lang w:val="ru-RU"/>
+        </w:rPr>
+        <w:t>или</w:t>
+      </w:r>
+      <w:r>
+        <w:t xml:space="preserve"> Scopus.)</w:t>
+      </w:r>
+    </w:p>
+    <w:p>
+      <w:pPr>
+        <w:numPr>
+          <w:ilvl w:val="0"/>
+          <w:numId w:val="13"/>
+        </w:numPr>
+        <w:spacing w:after="0"/>
+        <w:ind w:left="0" w:firstLine="709"/>
+        <w:rPr>
+          <w:lang w:val="ru-RU"/>
+        </w:rPr>
+      </w:pPr>
+      <w:proofErr w:type="spellStart"/>
+      <w:r>
+        <w:t>Augustinavichiute</w:t>
+      </w:r>
+      <w:proofErr w:type="spellEnd"/>
+      <w:r>
+        <w:t xml:space="preserve"> A. The Dual Nature of Man // Socionics, </w:t>
+      </w:r>
+      <w:proofErr w:type="spellStart"/>
+      <w:r>
+        <w:t>Mentology</w:t>
+      </w:r>
+      <w:proofErr w:type="spellEnd"/>
+      <w:r>
+        <w:t xml:space="preserve"> and Personality Psychology. — 1995. — No. 1. — P. 5–15. </w:t>
+      </w:r>
+      <w:r>
+        <w:rPr>
+          <w:lang w:val="ru-RU"/>
+        </w:rPr>
+        <w:t>(Классическая работа по соционике; доступна в виде перевода на англ. в ряде онлайн-архивов.)</w:t>
+      </w:r>
+    </w:p>
+    <w:p>
+      <w:pPr>
+        <w:numPr>
+          <w:ilvl w:val="0"/>
+          <w:numId w:val="13"/>
+        </w:numPr>
+        <w:spacing w:after="0"/>
+        <w:ind w:left="0" w:firstLine="709"/>
+        <w:rPr>
+          <w:lang w:val="ru-RU"/>
+        </w:rPr>
+      </w:pPr>
+      <w:proofErr w:type="spellStart"/>
+      <w:r>
+        <w:rPr>
+          <w:lang w:val="ru-RU"/>
+        </w:rPr>
+        <w:t>Кострикoва</w:t>
+      </w:r>
+      <w:proofErr w:type="spellEnd"/>
+      <w:r>
+        <w:rPr>
+          <w:lang w:val="ru-RU"/>
+        </w:rPr>
+        <w:t xml:space="preserve"> И. С. Введение в соционику. — М.: АСТ, 2014. — 320 с. — ISBN 978-5-17-083905-0</w:t>
+      </w:r>
+      <w:r>
+        <w:rPr>
+          <w:lang w:val="ru-RU"/>
+        </w:rPr>
+        <w:t xml:space="preserve"> </w:t>
+      </w:r>
+      <w:r>
+        <w:rPr>
+          <w:lang w:val="ru-RU"/>
+        </w:rPr>
+        <w:t>(Учебно-популярное изложение основных понятий соционики.)</w:t>
+      </w:r>
+    </w:p>
+    <w:p>
+      <w:pPr>
+        <w:numPr>
+          <w:ilvl w:val="0"/>
+          <w:numId w:val="13"/>
+        </w:numPr>
+        <w:spacing w:after="0"/>
+        <w:ind w:left="0" w:firstLine="709"/>
+      </w:pPr>
+      <w:proofErr w:type="spellStart"/>
+      <w:r>
+        <w:t>Reinin</w:t>
+      </w:r>
+      <w:proofErr w:type="spellEnd"/>
+      <w:r>
+        <w:t xml:space="preserve"> G. V. The Socionic Model of Information Metabolism: A Review // SSRN Electronic Journal. — 2022. — DOI: 10.2139/ssrn.3001323. — URL: </w:t>
+      </w:r>
+      <w:hyperlink r:id="rId12" w:history="1">
+        <w:r>
+          <w:rPr>
+            <w:rStyle w:val="a4"/>
+          </w:rPr>
+          <w:t>https://papers.ssrn.com/sol3/papers.cfm?abstract_id=3001323</w:t>
+        </w:r>
+      </w:hyperlink>
+      <w:r>
+        <w:t xml:space="preserve"> </w:t>
+      </w:r>
+      <w:r>
+        <w:t>(</w:t>
+      </w:r>
+      <w:r>
+        <w:rPr>
+          <w:lang w:val="ru-RU"/>
+        </w:rPr>
+        <w:t>дата</w:t>
+      </w:r>
+      <w:r>
+        <w:t xml:space="preserve"> </w:t>
+      </w:r>
+      <w:r>
+        <w:rPr>
+          <w:lang w:val="ru-RU"/>
+        </w:rPr>
+        <w:t>обращения</w:t>
+      </w:r>
+      <w:r>
+        <w:t>: 14.12.2025).</w:t>
+      </w:r>
+    </w:p>
+    <w:p>
+      <w:pPr>
+        <w:numPr>
+          <w:ilvl w:val="0"/>
+          <w:numId w:val="13"/>
+        </w:numPr>
+        <w:spacing w:after="0"/>
+        <w:ind w:left="0" w:firstLine="709"/>
+      </w:pPr>
+      <w:r>
+        <w:lastRenderedPageBreak/>
+        <w:t xml:space="preserve">Socionics // </w:t>
+      </w:r>
+      <w:proofErr w:type="spellStart"/>
+      <w:r>
+        <w:t>WikiDoc</w:t>
+      </w:r>
+      <w:proofErr w:type="spellEnd"/>
+      <w:r>
+        <w:t xml:space="preserve">. — 2012. — URL: </w:t>
+      </w:r>
+      <w:hyperlink r:id="rId13" w:history="1">
+        <w:r>
+          <w:rPr>
+            <w:rStyle w:val="a4"/>
+          </w:rPr>
+          <w:t>https://www.wikidoc.org/index.php/Socionics</w:t>
+        </w:r>
+      </w:hyperlink>
+      <w:r>
+        <w:t xml:space="preserve"> </w:t>
+      </w:r>
+      <w:r>
+        <w:t>(</w:t>
+      </w:r>
+      <w:r>
+        <w:rPr>
+          <w:lang w:val="ru-RU"/>
+        </w:rPr>
+        <w:t>дата</w:t>
+      </w:r>
+      <w:r>
+        <w:t xml:space="preserve"> </w:t>
+      </w:r>
+      <w:r>
+        <w:rPr>
+          <w:lang w:val="ru-RU"/>
+        </w:rPr>
+        <w:t>обращения</w:t>
+      </w:r>
+      <w:r>
+        <w:t>: 14.12.2025).</w:t>
+      </w:r>
+    </w:p>
+    <w:p>
+      <w:pPr>
+        <w:numPr>
+          <w:ilvl w:val="0"/>
+          <w:numId w:val="13"/>
+        </w:numPr>
+        <w:spacing w:after="0"/>
+        <w:ind w:left="0" w:firstLine="709"/>
+        <w:rPr>
+          <w:lang w:val="ru-RU"/>
+        </w:rPr>
+      </w:pPr>
+      <w:proofErr w:type="spellStart"/>
+      <w:r>
+        <w:rPr>
+          <w:lang w:val="ru-RU"/>
+        </w:rPr>
+        <w:t>Myers-Briggs</w:t>
+      </w:r>
+      <w:proofErr w:type="spellEnd"/>
+      <w:r>
+        <w:rPr>
+          <w:lang w:val="ru-RU"/>
+        </w:rPr>
+        <w:t xml:space="preserve"> Type </w:t>
+      </w:r>
+      <w:proofErr w:type="spellStart"/>
+      <w:r>
+        <w:rPr>
+          <w:lang w:val="ru-RU"/>
+        </w:rPr>
+        <w:t>Indicator</w:t>
+      </w:r>
+      <w:proofErr w:type="spellEnd"/>
+      <w:r>
+        <w:rPr>
+          <w:lang w:val="ru-RU"/>
+        </w:rPr>
+        <w:t xml:space="preserve"> (MBTI) // </w:t>
+      </w:r>
+      <w:proofErr w:type="spellStart"/>
+      <w:r>
+        <w:rPr>
+          <w:lang w:val="ru-RU"/>
+        </w:rPr>
+        <w:t>SimplyPsychology</w:t>
+      </w:r>
+      <w:proofErr w:type="spellEnd"/>
+      <w:r>
+        <w:rPr>
+          <w:lang w:val="ru-RU"/>
+        </w:rPr>
+        <w:t xml:space="preserve">. — 19.10.2025. — URL: </w:t>
+      </w:r>
+      <w:hyperlink r:id="rId14" w:history="1">
+        <w:r>
+          <w:rPr>
+            <w:rStyle w:val="a4"/>
             <w:lang w:val="ru-RU"/>
           </w:rPr>
-          <w:t>https://education.yandex.ru/handbook/ml/article/pervoe-znakomstvo-s-polnosvyaznymi-nejrosetyami</w:t>
+          <w:t>https://www.simplypsychology.org/the-myers-briggs-type-indicator.html</w:t>
         </w:r>
       </w:hyperlink>
       <w:r>
@@ -3575,24 +5853,687 @@
         <w:rPr>
           <w:lang w:val="ru-RU"/>
         </w:rPr>
-        <w:t>(дата обращения: 13.12.2025)</w:t>
-      </w:r>
-    </w:p>
-    <w:p>
-      <w:pPr>
-        <w:spacing w:after="0"/>
-        <w:rPr>
-          <w:lang w:val="ru-RU"/>
-        </w:rPr>
-      </w:pPr>
-    </w:p>
-    <w:p>
-      <w:pPr>
-        <w:spacing w:after="0"/>
-        <w:rPr>
-          <w:lang w:val="ru-RU"/>
-        </w:rPr>
-      </w:pPr>
+        <w:t>(дата обращения: 14.12.2025).</w:t>
+      </w:r>
+    </w:p>
+    <w:p>
+      <w:pPr>
+        <w:numPr>
+          <w:ilvl w:val="0"/>
+          <w:numId w:val="13"/>
+        </w:numPr>
+        <w:spacing w:after="0"/>
+        <w:ind w:left="0" w:firstLine="709"/>
+        <w:rPr>
+          <w:lang w:val="ru-RU"/>
+        </w:rPr>
+      </w:pPr>
+      <w:r>
+        <w:rPr>
+          <w:lang w:val="ru-RU"/>
+        </w:rPr>
+        <w:t>16</w:t>
+      </w:r>
+      <w:r>
+        <w:rPr>
+          <w:lang w:val="fr-FR"/>
+        </w:rPr>
+        <w:t>PF</w:t>
+      </w:r>
+      <w:r>
+        <w:rPr>
+          <w:lang w:val="ru-RU"/>
+        </w:rPr>
+        <w:t xml:space="preserve"> </w:t>
+      </w:r>
+      <w:r>
+        <w:rPr>
+          <w:lang w:val="fr-FR"/>
+        </w:rPr>
+        <w:t>Questionnaire</w:t>
+      </w:r>
+      <w:r>
+        <w:rPr>
+          <w:lang w:val="ru-RU"/>
+        </w:rPr>
+        <w:t xml:space="preserve"> // </w:t>
+      </w:r>
+      <w:proofErr w:type="spellStart"/>
+      <w:r>
+        <w:rPr>
+          <w:lang w:val="fr-FR"/>
+        </w:rPr>
+        <w:t>Wikipedia</w:t>
+      </w:r>
+      <w:proofErr w:type="spellEnd"/>
+      <w:r>
+        <w:rPr>
+          <w:lang w:val="ru-RU"/>
+        </w:rPr>
+        <w:t xml:space="preserve">. — 06.07.2008. — </w:t>
+      </w:r>
+      <w:r>
+        <w:rPr>
+          <w:lang w:val="fr-FR"/>
+        </w:rPr>
+        <w:t>URL</w:t>
+      </w:r>
+      <w:r>
+        <w:rPr>
+          <w:lang w:val="ru-RU"/>
+        </w:rPr>
+        <w:t xml:space="preserve">: </w:t>
+      </w:r>
+      <w:hyperlink r:id="rId15" w:history="1">
+        <w:r>
+          <w:rPr>
+            <w:rStyle w:val="a4"/>
+            <w:lang w:val="fr-FR"/>
+          </w:rPr>
+          <w:t>https</w:t>
+        </w:r>
+        <w:r>
+          <w:rPr>
+            <w:rStyle w:val="a4"/>
+            <w:lang w:val="ru-RU"/>
+          </w:rPr>
+          <w:t>://</w:t>
+        </w:r>
+        <w:r>
+          <w:rPr>
+            <w:rStyle w:val="a4"/>
+            <w:lang w:val="fr-FR"/>
+          </w:rPr>
+          <w:t>en</w:t>
+        </w:r>
+        <w:r>
+          <w:rPr>
+            <w:rStyle w:val="a4"/>
+            <w:lang w:val="ru-RU"/>
+          </w:rPr>
+          <w:t>.</w:t>
+        </w:r>
+        <w:proofErr w:type="spellStart"/>
+        <w:r>
+          <w:rPr>
+            <w:rStyle w:val="a4"/>
+            <w:lang w:val="fr-FR"/>
+          </w:rPr>
+          <w:t>wikipedia</w:t>
+        </w:r>
+        <w:proofErr w:type="spellEnd"/>
+        <w:r>
+          <w:rPr>
+            <w:rStyle w:val="a4"/>
+            <w:lang w:val="ru-RU"/>
+          </w:rPr>
+          <w:t>.</w:t>
+        </w:r>
+        <w:proofErr w:type="spellStart"/>
+        <w:r>
+          <w:rPr>
+            <w:rStyle w:val="a4"/>
+            <w:lang w:val="fr-FR"/>
+          </w:rPr>
+          <w:t>org</w:t>
+        </w:r>
+        <w:proofErr w:type="spellEnd"/>
+        <w:r>
+          <w:rPr>
+            <w:rStyle w:val="a4"/>
+            <w:lang w:val="ru-RU"/>
+          </w:rPr>
+          <w:t>/</w:t>
+        </w:r>
+        <w:r>
+          <w:rPr>
+            <w:rStyle w:val="a4"/>
+            <w:lang w:val="fr-FR"/>
+          </w:rPr>
+          <w:t>wiki</w:t>
+        </w:r>
+        <w:r>
+          <w:rPr>
+            <w:rStyle w:val="a4"/>
+            <w:lang w:val="ru-RU"/>
+          </w:rPr>
+          <w:t>/16</w:t>
+        </w:r>
+        <w:r>
+          <w:rPr>
+            <w:rStyle w:val="a4"/>
+            <w:lang w:val="fr-FR"/>
+          </w:rPr>
+          <w:t>PF</w:t>
+        </w:r>
+        <w:r>
+          <w:rPr>
+            <w:rStyle w:val="a4"/>
+            <w:lang w:val="ru-RU"/>
+          </w:rPr>
+          <w:t>_</w:t>
+        </w:r>
+        <w:r>
+          <w:rPr>
+            <w:rStyle w:val="a4"/>
+            <w:lang w:val="fr-FR"/>
+          </w:rPr>
+          <w:t>Questionnaire</w:t>
+        </w:r>
+      </w:hyperlink>
+      <w:r>
+        <w:rPr>
+          <w:lang w:val="ru-RU"/>
+        </w:rPr>
+        <w:t xml:space="preserve"> </w:t>
+      </w:r>
+      <w:r>
+        <w:rPr>
+          <w:lang w:val="ru-RU"/>
+        </w:rPr>
+        <w:t>(</w:t>
+      </w:r>
+      <w:r>
+        <w:rPr>
+          <w:lang w:val="ru-RU"/>
+        </w:rPr>
+        <w:t>дата</w:t>
+      </w:r>
+      <w:r>
+        <w:rPr>
+          <w:lang w:val="ru-RU"/>
+        </w:rPr>
+        <w:t xml:space="preserve"> </w:t>
+      </w:r>
+      <w:r>
+        <w:rPr>
+          <w:lang w:val="ru-RU"/>
+        </w:rPr>
+        <w:t>обращения</w:t>
+      </w:r>
+      <w:r>
+        <w:rPr>
+          <w:lang w:val="ru-RU"/>
+        </w:rPr>
+        <w:t>: 14.12.2025).</w:t>
+      </w:r>
+    </w:p>
+    <w:p>
+      <w:pPr>
+        <w:numPr>
+          <w:ilvl w:val="0"/>
+          <w:numId w:val="13"/>
+        </w:numPr>
+        <w:spacing w:after="0"/>
+        <w:ind w:left="0" w:firstLine="709"/>
+      </w:pPr>
+      <w:r>
+        <w:t xml:space="preserve">Differential Psychology // Wikipedia. — 26.12.2001. — URL: </w:t>
+      </w:r>
+      <w:hyperlink r:id="rId16" w:history="1">
+        <w:r>
+          <w:rPr>
+            <w:rStyle w:val="a4"/>
+          </w:rPr>
+          <w:t>https://en.wikipedia.org/wiki/Differential_psychology</w:t>
+        </w:r>
+      </w:hyperlink>
+      <w:r>
+        <w:t xml:space="preserve"> </w:t>
+      </w:r>
+      <w:r>
+        <w:t>(</w:t>
+      </w:r>
+      <w:r>
+        <w:rPr>
+          <w:lang w:val="ru-RU"/>
+        </w:rPr>
+        <w:t>дата</w:t>
+      </w:r>
+      <w:r>
+        <w:t xml:space="preserve"> </w:t>
+      </w:r>
+      <w:r>
+        <w:rPr>
+          <w:lang w:val="ru-RU"/>
+        </w:rPr>
+        <w:t>обращения</w:t>
+      </w:r>
+      <w:r>
+        <w:t>: 14.12.2025).</w:t>
+      </w:r>
+    </w:p>
+    <w:p>
+      <w:pPr>
+        <w:numPr>
+          <w:ilvl w:val="0"/>
+          <w:numId w:val="13"/>
+        </w:numPr>
+        <w:spacing w:after="0"/>
+        <w:ind w:left="0" w:firstLine="709"/>
+      </w:pPr>
+      <w:r>
+        <w:t xml:space="preserve">Ultimate Guide to Socionics and Personality Types // </w:t>
+      </w:r>
+      <w:proofErr w:type="spellStart"/>
+      <w:r>
+        <w:t>FormPlus</w:t>
+      </w:r>
+      <w:proofErr w:type="spellEnd"/>
+      <w:r>
+        <w:t xml:space="preserve"> Blog. — 19.04.2022. — URL: </w:t>
+      </w:r>
+      <w:hyperlink r:id="rId17" w:history="1">
+        <w:r>
+          <w:rPr>
+            <w:rStyle w:val="a4"/>
+          </w:rPr>
+          <w:t>https://www.formpl.us/blog/socionics-personality-types</w:t>
+        </w:r>
+      </w:hyperlink>
+      <w:r>
+        <w:t xml:space="preserve"> </w:t>
+      </w:r>
+      <w:r>
+        <w:t>(</w:t>
+      </w:r>
+      <w:r>
+        <w:rPr>
+          <w:lang w:val="ru-RU"/>
+        </w:rPr>
+        <w:t>дата</w:t>
+      </w:r>
+      <w:r>
+        <w:t xml:space="preserve"> </w:t>
+      </w:r>
+      <w:r>
+        <w:rPr>
+          <w:lang w:val="ru-RU"/>
+        </w:rPr>
+        <w:t>обращения</w:t>
+      </w:r>
+      <w:r>
+        <w:t>: 14.12.2025).</w:t>
+      </w:r>
+    </w:p>
+    <w:p>
+      <w:pPr>
+        <w:numPr>
+          <w:ilvl w:val="0"/>
+          <w:numId w:val="13"/>
+        </w:numPr>
+        <w:spacing w:after="0"/>
+        <w:ind w:left="0" w:firstLine="709"/>
+      </w:pPr>
+      <w:r>
+        <w:t xml:space="preserve">The 16PF Personality Questionnaire // AIPC Article Library. — URL: </w:t>
+      </w:r>
+      <w:hyperlink r:id="rId18" w:history="1">
+        <w:r>
+          <w:rPr>
+            <w:rStyle w:val="a4"/>
+          </w:rPr>
+          <w:t>https://www.aipc.net.au/articles/the-16pf-personality-questionnaire/</w:t>
+        </w:r>
+      </w:hyperlink>
+      <w:r>
+        <w:t xml:space="preserve"> </w:t>
+      </w:r>
+      <w:r>
+        <w:t>(</w:t>
+      </w:r>
+      <w:r>
+        <w:rPr>
+          <w:lang w:val="ru-RU"/>
+        </w:rPr>
+        <w:t>дата</w:t>
+      </w:r>
+      <w:r>
+        <w:t xml:space="preserve"> </w:t>
+      </w:r>
+      <w:r>
+        <w:rPr>
+          <w:lang w:val="ru-RU"/>
+        </w:rPr>
+        <w:t>обращения</w:t>
+      </w:r>
+      <w:r>
+        <w:t>: 14.12.2025).</w:t>
+      </w:r>
+    </w:p>
+    <w:p>
+      <w:pPr>
+        <w:numPr>
+          <w:ilvl w:val="0"/>
+          <w:numId w:val="13"/>
+        </w:numPr>
+        <w:spacing w:after="0"/>
+        <w:ind w:left="0" w:firstLine="709"/>
+      </w:pPr>
+      <w:r>
+        <w:t xml:space="preserve">The 16PF and MBTI Questionnaires – A Perfect Match // </w:t>
+      </w:r>
+      <w:proofErr w:type="spellStart"/>
+      <w:r>
+        <w:t>NovaConnection</w:t>
+      </w:r>
+      <w:proofErr w:type="spellEnd"/>
+      <w:r>
+        <w:t xml:space="preserve">. — URL: </w:t>
+      </w:r>
+      <w:hyperlink r:id="rId19" w:history="1">
+        <w:r>
+          <w:rPr>
+            <w:rStyle w:val="a4"/>
+          </w:rPr>
+          <w:t>http://www.novaconnection.com/downloads/mbti%20and%2016pf%20match.pdf</w:t>
+        </w:r>
+      </w:hyperlink>
+      <w:r>
+        <w:t xml:space="preserve"> </w:t>
+      </w:r>
+      <w:r>
+        <w:t>(</w:t>
+      </w:r>
+      <w:r>
+        <w:rPr>
+          <w:lang w:val="ru-RU"/>
+        </w:rPr>
+        <w:t>дата</w:t>
+      </w:r>
+      <w:r>
+        <w:t xml:space="preserve"> </w:t>
+      </w:r>
+      <w:r>
+        <w:rPr>
+          <w:lang w:val="ru-RU"/>
+        </w:rPr>
+        <w:t>обращения</w:t>
+      </w:r>
+      <w:r>
+        <w:t>: 14.12.2025).</w:t>
+      </w:r>
+    </w:p>
+    <w:p>
+      <w:pPr>
+        <w:numPr>
+          <w:ilvl w:val="0"/>
+          <w:numId w:val="13"/>
+        </w:numPr>
+        <w:spacing w:after="0"/>
+        <w:ind w:left="0" w:firstLine="709"/>
+      </w:pPr>
+      <w:r>
+        <w:t xml:space="preserve">MBTI Preferences: How Do You Prefer to Be? // The Myers-Briggs Company. — 19.07.2023. — URL: </w:t>
+      </w:r>
+      <w:hyperlink r:id="rId20" w:history="1">
+        <w:r>
+          <w:rPr>
+            <w:rStyle w:val="a4"/>
+          </w:rPr>
+          <w:t>https://www.myersbriggs.org/my-mbti-personality-type/the-mbti-preferences/</w:t>
+        </w:r>
+      </w:hyperlink>
+      <w:r>
+        <w:t xml:space="preserve"> </w:t>
+      </w:r>
+      <w:r>
+        <w:t>(</w:t>
+      </w:r>
+      <w:r>
+        <w:rPr>
+          <w:lang w:val="ru-RU"/>
+        </w:rPr>
+        <w:t>дата</w:t>
+      </w:r>
+      <w:r>
+        <w:t xml:space="preserve"> </w:t>
+      </w:r>
+      <w:r>
+        <w:rPr>
+          <w:lang w:val="ru-RU"/>
+        </w:rPr>
+        <w:t>обращения</w:t>
+      </w:r>
+      <w:r>
+        <w:t>: 14.12.2025).</w:t>
+      </w:r>
+    </w:p>
+    <w:p>
+      <w:pPr>
+        <w:numPr>
+          <w:ilvl w:val="0"/>
+          <w:numId w:val="13"/>
+        </w:numPr>
+        <w:spacing w:after="0"/>
+        <w:ind w:left="0" w:firstLine="709"/>
+      </w:pPr>
+      <w:r>
+        <w:lastRenderedPageBreak/>
+        <w:t xml:space="preserve">Personality Assessment: A Complete Guide // MVS Psychology. — 01.10.2025. — URL: </w:t>
+      </w:r>
+      <w:hyperlink r:id="rId21" w:history="1">
+        <w:r>
+          <w:rPr>
+            <w:rStyle w:val="a4"/>
+          </w:rPr>
+          <w:t>https://www.mvspsychology.com.au/personality-assessment-complete-guide/</w:t>
+        </w:r>
+      </w:hyperlink>
+      <w:r>
+        <w:t xml:space="preserve"> </w:t>
+      </w:r>
+      <w:r>
+        <w:t>(</w:t>
+      </w:r>
+      <w:r>
+        <w:rPr>
+          <w:lang w:val="ru-RU"/>
+        </w:rPr>
+        <w:t>дата</w:t>
+      </w:r>
+      <w:r>
+        <w:t xml:space="preserve"> </w:t>
+      </w:r>
+      <w:r>
+        <w:rPr>
+          <w:lang w:val="ru-RU"/>
+        </w:rPr>
+        <w:t>обращения</w:t>
+      </w:r>
+      <w:r>
+        <w:t>: 14.12.2025).</w:t>
+      </w:r>
+    </w:p>
+    <w:p>
+      <w:pPr>
+        <w:numPr>
+          <w:ilvl w:val="0"/>
+          <w:numId w:val="13"/>
+        </w:numPr>
+        <w:spacing w:after="0"/>
+        <w:ind w:left="0" w:firstLine="709"/>
+      </w:pPr>
+      <w:r>
+        <w:t xml:space="preserve">Socionics Archetype Center // </w:t>
+      </w:r>
+      <w:r>
+        <w:rPr>
+          <w:lang w:val="ru-RU"/>
+        </w:rPr>
+        <w:t>Центр</w:t>
+      </w:r>
+      <w:r>
+        <w:t xml:space="preserve"> «</w:t>
+      </w:r>
+      <w:r>
+        <w:rPr>
+          <w:lang w:val="ru-RU"/>
+        </w:rPr>
+        <w:t>Архетип</w:t>
+      </w:r>
+      <w:r>
+        <w:t xml:space="preserve">». — 28.02.2021. — URL: </w:t>
+      </w:r>
+      <w:hyperlink r:id="rId22" w:history="1">
+        <w:r>
+          <w:rPr>
+            <w:rStyle w:val="a4"/>
+          </w:rPr>
+          <w:t>https://archetype-center.ru/en/</w:t>
+        </w:r>
+      </w:hyperlink>
+      <w:r>
+        <w:t xml:space="preserve"> </w:t>
+      </w:r>
+      <w:r>
+        <w:t>(</w:t>
+      </w:r>
+      <w:r>
+        <w:rPr>
+          <w:lang w:val="ru-RU"/>
+        </w:rPr>
+        <w:t>дата</w:t>
+      </w:r>
+      <w:r>
+        <w:t xml:space="preserve"> </w:t>
+      </w:r>
+      <w:r>
+        <w:rPr>
+          <w:lang w:val="ru-RU"/>
+        </w:rPr>
+        <w:t>обращения</w:t>
+      </w:r>
+      <w:r>
+        <w:t>: 14.12.2025).</w:t>
+      </w:r>
+    </w:p>
+    <w:p>
+      <w:pPr>
+        <w:numPr>
+          <w:ilvl w:val="0"/>
+          <w:numId w:val="13"/>
+        </w:numPr>
+        <w:spacing w:after="0"/>
+        <w:ind w:left="0" w:firstLine="709"/>
+        <w:rPr>
+          <w:lang w:val="ru-RU"/>
+        </w:rPr>
+      </w:pPr>
+      <w:r>
+        <w:rPr>
+          <w:lang w:val="ru-RU"/>
+        </w:rPr>
+        <w:t xml:space="preserve">Сравнение MBTI и 16PF (форум и обзор) // </w:t>
+      </w:r>
+      <w:proofErr w:type="spellStart"/>
+      <w:r>
+        <w:rPr>
+          <w:lang w:val="ru-RU"/>
+        </w:rPr>
+        <w:t>This</w:t>
+      </w:r>
+      <w:proofErr w:type="spellEnd"/>
+      <w:r>
+        <w:rPr>
+          <w:lang w:val="ru-RU"/>
+        </w:rPr>
+        <w:t xml:space="preserve"> </w:t>
+      </w:r>
+      <w:proofErr w:type="spellStart"/>
+      <w:r>
+        <w:rPr>
+          <w:lang w:val="ru-RU"/>
+        </w:rPr>
+        <w:t>vs</w:t>
+      </w:r>
+      <w:proofErr w:type="spellEnd"/>
+      <w:r>
+        <w:rPr>
+          <w:lang w:val="ru-RU"/>
+        </w:rPr>
+        <w:t xml:space="preserve">. </w:t>
+      </w:r>
+      <w:proofErr w:type="spellStart"/>
+      <w:r>
+        <w:rPr>
+          <w:lang w:val="ru-RU"/>
+        </w:rPr>
+        <w:t>That</w:t>
+      </w:r>
+      <w:proofErr w:type="spellEnd"/>
+      <w:r>
+        <w:rPr>
+          <w:lang w:val="ru-RU"/>
+        </w:rPr>
+        <w:t xml:space="preserve">. — URL: </w:t>
+      </w:r>
+      <w:hyperlink r:id="rId23" w:history="1">
+        <w:r>
+          <w:rPr>
+            <w:rStyle w:val="a4"/>
+            <w:lang w:val="ru-RU"/>
+          </w:rPr>
+          <w:t>https://thisvsthat.io/16pf-vs-mbti</w:t>
+        </w:r>
+      </w:hyperlink>
+      <w:r>
+        <w:rPr>
+          <w:lang w:val="ru-RU"/>
+        </w:rPr>
+        <w:t xml:space="preserve"> </w:t>
+      </w:r>
+      <w:r>
+        <w:rPr>
+          <w:lang w:val="ru-RU"/>
+        </w:rPr>
+        <w:t>(дата обращения: 14.12.2025).</w:t>
+      </w:r>
+    </w:p>
+    <w:p>
+      <w:pPr>
+        <w:numPr>
+          <w:ilvl w:val="0"/>
+          <w:numId w:val="13"/>
+        </w:numPr>
+        <w:spacing w:after="0"/>
+        <w:ind w:left="0" w:firstLine="709"/>
+        <w:rPr>
+          <w:lang w:val="ru-RU"/>
+        </w:rPr>
+      </w:pPr>
+      <w:r>
+        <w:rPr>
+          <w:lang w:val="ru-RU"/>
+        </w:rPr>
+        <w:t xml:space="preserve">Шмелёв А. Г. Психологические тесты: от разработки до применения. — М.: Институт психологии РАН, 2013. — 400 с. — ISBN 978-5-9270-0252-7. (Общие вопросы </w:t>
+      </w:r>
+      <w:proofErr w:type="spellStart"/>
+      <w:r>
+        <w:rPr>
+          <w:lang w:val="ru-RU"/>
+        </w:rPr>
+        <w:t>психометрики</w:t>
+      </w:r>
+      <w:proofErr w:type="spellEnd"/>
+      <w:r>
+        <w:rPr>
+          <w:lang w:val="ru-RU"/>
+        </w:rPr>
+        <w:t xml:space="preserve">, валидности и надёжности тестов, которые можно </w:t>
+      </w:r>
+      <w:r>
+        <w:rPr>
+          <w:lang w:val="ru-RU"/>
+        </w:rPr>
+        <w:t>соотнести</w:t>
+      </w:r>
+      <w:r>
+        <w:rPr>
+          <w:lang w:val="ru-RU"/>
+        </w:rPr>
+        <w:t xml:space="preserve"> к критике MBTI и соционики.)</w:t>
+      </w:r>
     </w:p>
     <w:p>
       <w:pPr>
@@ -3617,7 +6558,7 @@
       </w:r>
     </w:p>
     <w:sectPr>
-      <w:footerReference w:type="default" r:id="rId12"/>
+      <w:footerReference w:type="default" r:id="rId24"/>
       <w:type w:val="continuous"/>
       <w:pgSz w:w="12240" w:h="15840"/>
       <w:pgMar w:top="1440" w:right="1797" w:bottom="1440" w:left="1797" w:header="720" w:footer="720" w:gutter="0"/>
@@ -5438,6 +8379,119 @@
     </w:lvl>
   </w:abstractNum>
   <w:abstractNum w:abstractNumId="13" w15:restartNumberingAfterBreak="0">
+    <w:nsid w:val="2A6A5800"/>
+    <w:multiLevelType w:val="multilevel"/>
+    <w:tmpl w:val="64101970"/>
+    <w:lvl w:ilvl="0">
+      <w:start w:val="1"/>
+      <w:numFmt w:val="decimal"/>
+      <w:lvlText w:val="%1."/>
+      <w:lvlJc w:val="left"/>
+      <w:pPr>
+        <w:tabs>
+          <w:tab w:val="num" w:pos="1428"/>
+        </w:tabs>
+        <w:ind w:left="1428" w:hanging="360"/>
+      </w:pPr>
+    </w:lvl>
+    <w:lvl w:ilvl="1" w:tentative="1">
+      <w:start w:val="1"/>
+      <w:numFmt w:val="decimal"/>
+      <w:lvlText w:val="%2."/>
+      <w:lvlJc w:val="left"/>
+      <w:pPr>
+        <w:tabs>
+          <w:tab w:val="num" w:pos="2148"/>
+        </w:tabs>
+        <w:ind w:left="2148" w:hanging="360"/>
+      </w:pPr>
+    </w:lvl>
+    <w:lvl w:ilvl="2" w:tentative="1">
+      <w:start w:val="1"/>
+      <w:numFmt w:val="decimal"/>
+      <w:lvlText w:val="%3."/>
+      <w:lvlJc w:val="left"/>
+      <w:pPr>
+        <w:tabs>
+          <w:tab w:val="num" w:pos="2868"/>
+        </w:tabs>
+        <w:ind w:left="2868" w:hanging="360"/>
+      </w:pPr>
+    </w:lvl>
+    <w:lvl w:ilvl="3" w:tentative="1">
+      <w:start w:val="1"/>
+      <w:numFmt w:val="decimal"/>
+      <w:lvlText w:val="%4."/>
+      <w:lvlJc w:val="left"/>
+      <w:pPr>
+        <w:tabs>
+          <w:tab w:val="num" w:pos="3588"/>
+        </w:tabs>
+        <w:ind w:left="3588" w:hanging="360"/>
+      </w:pPr>
+    </w:lvl>
+    <w:lvl w:ilvl="4" w:tentative="1">
+      <w:start w:val="1"/>
+      <w:numFmt w:val="decimal"/>
+      <w:lvlText w:val="%5."/>
+      <w:lvlJc w:val="left"/>
+      <w:pPr>
+        <w:tabs>
+          <w:tab w:val="num" w:pos="4308"/>
+        </w:tabs>
+        <w:ind w:left="4308" w:hanging="360"/>
+      </w:pPr>
+    </w:lvl>
+    <w:lvl w:ilvl="5" w:tentative="1">
+      <w:start w:val="1"/>
+      <w:numFmt w:val="decimal"/>
+      <w:lvlText w:val="%6."/>
+      <w:lvlJc w:val="left"/>
+      <w:pPr>
+        <w:tabs>
+          <w:tab w:val="num" w:pos="5028"/>
+        </w:tabs>
+        <w:ind w:left="5028" w:hanging="360"/>
+      </w:pPr>
+    </w:lvl>
+    <w:lvl w:ilvl="6" w:tentative="1">
+      <w:start w:val="1"/>
+      <w:numFmt w:val="decimal"/>
+      <w:lvlText w:val="%7."/>
+      <w:lvlJc w:val="left"/>
+      <w:pPr>
+        <w:tabs>
+          <w:tab w:val="num" w:pos="5748"/>
+        </w:tabs>
+        <w:ind w:left="5748" w:hanging="360"/>
+      </w:pPr>
+    </w:lvl>
+    <w:lvl w:ilvl="7" w:tentative="1">
+      <w:start w:val="1"/>
+      <w:numFmt w:val="decimal"/>
+      <w:lvlText w:val="%8."/>
+      <w:lvlJc w:val="left"/>
+      <w:pPr>
+        <w:tabs>
+          <w:tab w:val="num" w:pos="6468"/>
+        </w:tabs>
+        <w:ind w:left="6468" w:hanging="360"/>
+      </w:pPr>
+    </w:lvl>
+    <w:lvl w:ilvl="8" w:tentative="1">
+      <w:start w:val="1"/>
+      <w:numFmt w:val="decimal"/>
+      <w:lvlText w:val="%9."/>
+      <w:lvlJc w:val="left"/>
+      <w:pPr>
+        <w:tabs>
+          <w:tab w:val="num" w:pos="7188"/>
+        </w:tabs>
+        <w:ind w:left="7188" w:hanging="360"/>
+      </w:pPr>
+    </w:lvl>
+  </w:abstractNum>
+  <w:abstractNum w:abstractNumId="14" w15:restartNumberingAfterBreak="0">
     <w:nsid w:val="2FEC1C27"/>
     <w:multiLevelType w:val="multilevel"/>
     <w:tmpl w:val="6B4826E2"/>
@@ -5586,7 +8640,7 @@
       </w:rPr>
     </w:lvl>
   </w:abstractNum>
-  <w:abstractNum w:abstractNumId="14" w15:restartNumberingAfterBreak="0">
+  <w:abstractNum w:abstractNumId="15" w15:restartNumberingAfterBreak="0">
     <w:nsid w:val="3079477D"/>
     <w:multiLevelType w:val="multilevel"/>
     <w:tmpl w:val="B70A689E"/>
@@ -5735,7 +8789,7 @@
       </w:rPr>
     </w:lvl>
   </w:abstractNum>
-  <w:abstractNum w:abstractNumId="15" w15:restartNumberingAfterBreak="0">
+  <w:abstractNum w:abstractNumId="16" w15:restartNumberingAfterBreak="0">
     <w:nsid w:val="340611D9"/>
     <w:multiLevelType w:val="multilevel"/>
     <w:tmpl w:val="BBBE1380"/>
@@ -5884,7 +8938,7 @@
       </w:rPr>
     </w:lvl>
   </w:abstractNum>
-  <w:abstractNum w:abstractNumId="16" w15:restartNumberingAfterBreak="0">
+  <w:abstractNum w:abstractNumId="17" w15:restartNumberingAfterBreak="0">
     <w:nsid w:val="34BE249D"/>
     <w:multiLevelType w:val="multilevel"/>
     <w:tmpl w:val="974A98B2"/>
@@ -5997,7 +9051,7 @@
       </w:pPr>
     </w:lvl>
   </w:abstractNum>
-  <w:abstractNum w:abstractNumId="17" w15:restartNumberingAfterBreak="0">
+  <w:abstractNum w:abstractNumId="18" w15:restartNumberingAfterBreak="0">
     <w:nsid w:val="3A1902AF"/>
     <w:multiLevelType w:val="multilevel"/>
     <w:tmpl w:val="4B1493E4"/>
@@ -6110,7 +9164,7 @@
       </w:pPr>
     </w:lvl>
   </w:abstractNum>
-  <w:abstractNum w:abstractNumId="18" w15:restartNumberingAfterBreak="0">
+  <w:abstractNum w:abstractNumId="19" w15:restartNumberingAfterBreak="0">
     <w:nsid w:val="3B196FA9"/>
     <w:multiLevelType w:val="multilevel"/>
     <w:tmpl w:val="0FDCC388"/>
@@ -6259,7 +9313,7 @@
       </w:rPr>
     </w:lvl>
   </w:abstractNum>
-  <w:abstractNum w:abstractNumId="19" w15:restartNumberingAfterBreak="0">
+  <w:abstractNum w:abstractNumId="20" w15:restartNumberingAfterBreak="0">
     <w:nsid w:val="3B2C5487"/>
     <w:multiLevelType w:val="multilevel"/>
     <w:tmpl w:val="F64E9D6C"/>
@@ -6408,7 +9462,7 @@
       </w:rPr>
     </w:lvl>
   </w:abstractNum>
-  <w:abstractNum w:abstractNumId="20" w15:restartNumberingAfterBreak="0">
+  <w:abstractNum w:abstractNumId="21" w15:restartNumberingAfterBreak="0">
     <w:nsid w:val="3BBA7C35"/>
     <w:multiLevelType w:val="multilevel"/>
     <w:tmpl w:val="A636FFF2"/>
@@ -6557,7 +9611,7 @@
       </w:rPr>
     </w:lvl>
   </w:abstractNum>
-  <w:abstractNum w:abstractNumId="21" w15:restartNumberingAfterBreak="0">
+  <w:abstractNum w:abstractNumId="22" w15:restartNumberingAfterBreak="0">
     <w:nsid w:val="3C8D1D27"/>
     <w:multiLevelType w:val="multilevel"/>
     <w:tmpl w:val="516C25A4"/>
@@ -6706,7 +9760,7 @@
       </w:rPr>
     </w:lvl>
   </w:abstractNum>
-  <w:abstractNum w:abstractNumId="22" w15:restartNumberingAfterBreak="0">
+  <w:abstractNum w:abstractNumId="23" w15:restartNumberingAfterBreak="0">
     <w:nsid w:val="3D5A6F53"/>
     <w:multiLevelType w:val="multilevel"/>
     <w:tmpl w:val="4462B936"/>
@@ -6819,7 +9873,7 @@
       </w:pPr>
     </w:lvl>
   </w:abstractNum>
-  <w:abstractNum w:abstractNumId="23" w15:restartNumberingAfterBreak="0">
+  <w:abstractNum w:abstractNumId="24" w15:restartNumberingAfterBreak="0">
     <w:nsid w:val="3E8A69ED"/>
     <w:multiLevelType w:val="multilevel"/>
     <w:tmpl w:val="F7D2EB0A"/>
@@ -6968,7 +10022,7 @@
       </w:rPr>
     </w:lvl>
   </w:abstractNum>
-  <w:abstractNum w:abstractNumId="24" w15:restartNumberingAfterBreak="0">
+  <w:abstractNum w:abstractNumId="25" w15:restartNumberingAfterBreak="0">
     <w:nsid w:val="4BB407BD"/>
     <w:multiLevelType w:val="multilevel"/>
     <w:tmpl w:val="0C36ED98"/>
@@ -7117,7 +10171,7 @@
       </w:rPr>
     </w:lvl>
   </w:abstractNum>
-  <w:abstractNum w:abstractNumId="25" w15:restartNumberingAfterBreak="0">
+  <w:abstractNum w:abstractNumId="26" w15:restartNumberingAfterBreak="0">
     <w:nsid w:val="57A228F0"/>
     <w:multiLevelType w:val="multilevel"/>
     <w:tmpl w:val="5672D2A8"/>
@@ -7230,7 +10284,7 @@
       </w:pPr>
     </w:lvl>
   </w:abstractNum>
-  <w:abstractNum w:abstractNumId="26" w15:restartNumberingAfterBreak="0">
+  <w:abstractNum w:abstractNumId="27" w15:restartNumberingAfterBreak="0">
     <w:nsid w:val="613449EE"/>
     <w:multiLevelType w:val="multilevel"/>
     <w:tmpl w:val="D85A9930"/>
@@ -7379,7 +10433,7 @@
       </w:rPr>
     </w:lvl>
   </w:abstractNum>
-  <w:abstractNum w:abstractNumId="27" w15:restartNumberingAfterBreak="0">
+  <w:abstractNum w:abstractNumId="28" w15:restartNumberingAfterBreak="0">
     <w:nsid w:val="633F3348"/>
     <w:multiLevelType w:val="multilevel"/>
     <w:tmpl w:val="2D3A562E"/>
@@ -7528,7 +10582,7 @@
       </w:rPr>
     </w:lvl>
   </w:abstractNum>
-  <w:abstractNum w:abstractNumId="28" w15:restartNumberingAfterBreak="0">
+  <w:abstractNum w:abstractNumId="29" w15:restartNumberingAfterBreak="0">
     <w:nsid w:val="6792258D"/>
     <w:multiLevelType w:val="multilevel"/>
     <w:tmpl w:val="ACC8E234"/>
@@ -7641,7 +10695,7 @@
       </w:pPr>
     </w:lvl>
   </w:abstractNum>
-  <w:abstractNum w:abstractNumId="29" w15:restartNumberingAfterBreak="0">
+  <w:abstractNum w:abstractNumId="30" w15:restartNumberingAfterBreak="0">
     <w:nsid w:val="67DB1A41"/>
     <w:multiLevelType w:val="multilevel"/>
     <w:tmpl w:val="AFCCC964"/>
@@ -7754,7 +10808,7 @@
       </w:pPr>
     </w:lvl>
   </w:abstractNum>
-  <w:abstractNum w:abstractNumId="30" w15:restartNumberingAfterBreak="0">
+  <w:abstractNum w:abstractNumId="31" w15:restartNumberingAfterBreak="0">
     <w:nsid w:val="692A43E9"/>
     <w:multiLevelType w:val="multilevel"/>
     <w:tmpl w:val="08785FA4"/>
@@ -7903,7 +10957,7 @@
       </w:rPr>
     </w:lvl>
   </w:abstractNum>
-  <w:abstractNum w:abstractNumId="31" w15:restartNumberingAfterBreak="0">
+  <w:abstractNum w:abstractNumId="32" w15:restartNumberingAfterBreak="0">
     <w:nsid w:val="6CF23DB8"/>
     <w:multiLevelType w:val="multilevel"/>
     <w:tmpl w:val="E29616EE"/>
@@ -8052,7 +11106,7 @@
       </w:rPr>
     </w:lvl>
   </w:abstractNum>
-  <w:abstractNum w:abstractNumId="32" w15:restartNumberingAfterBreak="0">
+  <w:abstractNum w:abstractNumId="33" w15:restartNumberingAfterBreak="0">
     <w:nsid w:val="70E41978"/>
     <w:multiLevelType w:val="multilevel"/>
     <w:tmpl w:val="9A7E5B0A"/>
@@ -8201,7 +11255,7 @@
       </w:rPr>
     </w:lvl>
   </w:abstractNum>
-  <w:abstractNum w:abstractNumId="33" w15:restartNumberingAfterBreak="0">
+  <w:abstractNum w:abstractNumId="34" w15:restartNumberingAfterBreak="0">
     <w:nsid w:val="71516F57"/>
     <w:multiLevelType w:val="multilevel"/>
     <w:tmpl w:val="6318EDBA"/>
@@ -8350,7 +11404,7 @@
       </w:rPr>
     </w:lvl>
   </w:abstractNum>
-  <w:abstractNum w:abstractNumId="34" w15:restartNumberingAfterBreak="0">
+  <w:abstractNum w:abstractNumId="35" w15:restartNumberingAfterBreak="0">
     <w:nsid w:val="75B03FC1"/>
     <w:multiLevelType w:val="multilevel"/>
     <w:tmpl w:val="43D22514"/>
@@ -8463,7 +11517,7 @@
       </w:pPr>
     </w:lvl>
   </w:abstractNum>
-  <w:abstractNum w:abstractNumId="35" w15:restartNumberingAfterBreak="0">
+  <w:abstractNum w:abstractNumId="36" w15:restartNumberingAfterBreak="0">
     <w:nsid w:val="7E636DF4"/>
     <w:multiLevelType w:val="multilevel"/>
     <w:tmpl w:val="F19A535C"/>
@@ -8613,49 +11667,49 @@
     </w:lvl>
   </w:abstractNum>
   <w:num w:numId="1" w16cid:durableId="46809093">
-    <w:abstractNumId w:val="22"/>
+    <w:abstractNumId w:val="23"/>
   </w:num>
   <w:num w:numId="2" w16cid:durableId="628053885">
     <w:abstractNumId w:val="3"/>
   </w:num>
   <w:num w:numId="3" w16cid:durableId="1537695617">
-    <w:abstractNumId w:val="34"/>
+    <w:abstractNumId w:val="35"/>
   </w:num>
   <w:num w:numId="4" w16cid:durableId="722169972">
     <w:abstractNumId w:val="12"/>
   </w:num>
   <w:num w:numId="5" w16cid:durableId="86660097">
-    <w:abstractNumId w:val="25"/>
+    <w:abstractNumId w:val="26"/>
   </w:num>
   <w:num w:numId="6" w16cid:durableId="1349982687">
     <w:abstractNumId w:val="0"/>
   </w:num>
   <w:num w:numId="7" w16cid:durableId="1244994490">
-    <w:abstractNumId w:val="29"/>
+    <w:abstractNumId w:val="30"/>
   </w:num>
   <w:num w:numId="8" w16cid:durableId="1284000227">
-    <w:abstractNumId w:val="27"/>
+    <w:abstractNumId w:val="28"/>
   </w:num>
   <w:num w:numId="9" w16cid:durableId="1131628252">
-    <w:abstractNumId w:val="23"/>
+    <w:abstractNumId w:val="24"/>
   </w:num>
   <w:num w:numId="10" w16cid:durableId="1818567975">
-    <w:abstractNumId w:val="19"/>
+    <w:abstractNumId w:val="20"/>
   </w:num>
   <w:num w:numId="11" w16cid:durableId="1884946623">
     <w:abstractNumId w:val="1"/>
   </w:num>
   <w:num w:numId="12" w16cid:durableId="831523911">
-    <w:abstractNumId w:val="21"/>
+    <w:abstractNumId w:val="22"/>
   </w:num>
   <w:num w:numId="13" w16cid:durableId="1055785025">
-    <w:abstractNumId w:val="28"/>
+    <w:abstractNumId w:val="29"/>
   </w:num>
   <w:num w:numId="14" w16cid:durableId="791092426">
-    <w:abstractNumId w:val="15"/>
+    <w:abstractNumId w:val="16"/>
   </w:num>
   <w:num w:numId="15" w16cid:durableId="1929191172">
-    <w:abstractNumId w:val="14"/>
+    <w:abstractNumId w:val="15"/>
   </w:num>
   <w:num w:numId="16" w16cid:durableId="225607271">
     <w:abstractNumId w:val="11"/>
@@ -8667,40 +11721,40 @@
     <w:abstractNumId w:val="2"/>
   </w:num>
   <w:num w:numId="19" w16cid:durableId="1784668">
-    <w:abstractNumId w:val="32"/>
+    <w:abstractNumId w:val="33"/>
   </w:num>
   <w:num w:numId="20" w16cid:durableId="970398405">
     <w:abstractNumId w:val="6"/>
   </w:num>
   <w:num w:numId="21" w16cid:durableId="177042199">
-    <w:abstractNumId w:val="13"/>
+    <w:abstractNumId w:val="14"/>
   </w:num>
   <w:num w:numId="22" w16cid:durableId="648438680">
     <w:abstractNumId w:val="7"/>
   </w:num>
   <w:num w:numId="23" w16cid:durableId="1152719114">
-    <w:abstractNumId w:val="35"/>
+    <w:abstractNumId w:val="36"/>
   </w:num>
   <w:num w:numId="24" w16cid:durableId="1337999176">
-    <w:abstractNumId w:val="20"/>
+    <w:abstractNumId w:val="21"/>
   </w:num>
   <w:num w:numId="25" w16cid:durableId="278949939">
-    <w:abstractNumId w:val="31"/>
+    <w:abstractNumId w:val="32"/>
   </w:num>
   <w:num w:numId="26" w16cid:durableId="595862998">
     <w:abstractNumId w:val="10"/>
   </w:num>
   <w:num w:numId="27" w16cid:durableId="1636595925">
-    <w:abstractNumId w:val="18"/>
+    <w:abstractNumId w:val="19"/>
   </w:num>
   <w:num w:numId="28" w16cid:durableId="1328172369">
-    <w:abstractNumId w:val="24"/>
+    <w:abstractNumId w:val="25"/>
   </w:num>
   <w:num w:numId="29" w16cid:durableId="1215847187">
-    <w:abstractNumId w:val="30"/>
+    <w:abstractNumId w:val="31"/>
   </w:num>
   <w:num w:numId="30" w16cid:durableId="70352464">
-    <w:abstractNumId w:val="17"/>
+    <w:abstractNumId w:val="18"/>
   </w:num>
   <w:num w:numId="31" w16cid:durableId="1974406137">
     <w:abstractNumId w:val="4"/>
@@ -8709,16 +11763,19 @@
     <w:abstractNumId w:val="9"/>
   </w:num>
   <w:num w:numId="33" w16cid:durableId="374427239">
-    <w:abstractNumId w:val="26"/>
+    <w:abstractNumId w:val="27"/>
   </w:num>
   <w:num w:numId="34" w16cid:durableId="850411837">
     <w:abstractNumId w:val="8"/>
   </w:num>
   <w:num w:numId="35" w16cid:durableId="1334143598">
-    <w:abstractNumId w:val="33"/>
+    <w:abstractNumId w:val="34"/>
   </w:num>
   <w:num w:numId="36" w16cid:durableId="906114250">
-    <w:abstractNumId w:val="16"/>
+    <w:abstractNumId w:val="17"/>
+  </w:num>
+  <w:num w:numId="37" w16cid:durableId="687146786">
+    <w:abstractNumId w:val="13"/>
   </w:num>
 </w:numbering>
 </file>

</xml_diff>